<commit_message>
List Group B materials separately, restore 500/2000 h points, add English basic test plan
The Turkish basic plan now gives each Group B material (PX, PT, PS, EP,
PA) its own row with source and request notes, and measures the oil and
air arms at 500, 1000 and 2000 h with the tracked specimens returned
after each intermediate point. Specimen counts (61 per family) and the
schedule (about 17 weeks) follow. Adds the matching English version.

Co-Authored-By: Claude Opus 5.5 <noreply@anthropic.com>
Claude-Session: https://claude.ai/code/session_01BvXxbcg7cqwc3TvyomY2Mh
</commit_message>
<xml_diff>
--- a/reports/Hairpin yalıtımları temel test planı.docx
+++ b/reports/Hairpin yalıtımları temel test planı.docx
@@ -53,7 +53,7 @@
           <w:sz w:val="18"/>
           <w:szCs w:val="18"/>
         </w:rPr>
-        <w:t xml:space="preserve">Taslak 3 — temel plan</w:t>
+        <w:t xml:space="preserve">Taslak 4 — temel plan</w:t>
       </w:r>
       <w:r>
         <w:rPr>
@@ -88,7 +88,7 @@
           <w:sz w:val="20"/>
           <w:szCs w:val="20"/>
         </w:rPr>
-        <w:t xml:space="preserve">Test iki aşamadan oluşur. Aşama 1'de numuneler yağsız ölçülür. Aşama 2'de aynı numuneler 150 °C'de 1000 h yaşlandırılır: yarısı e-yağda (YK), yarısı havada (HK). Ardından aynı ölçümler tekrarlanır.</w:t>
+        <w:t xml:space="preserve">Test iki aşamadan oluşur. Aşama 1'de numuneler yağsız ölçülür. Aşama 2'de aynı numuneler 150 °C'de 2000 h yaşlandırılır: yarısı e-yağda (YK), yarısı havada (HK). Ölçümler 500, 1000 ve 2000 h'te tekrarlanır.</w:t>
       </w:r>
     </w:p>
     <w:p>
@@ -123,9 +123,10 @@
       </w:tblPr>
       <w:tblGrid>
         <w:gridCol w:w="700"/>
-        <w:gridCol w:w="4562"/>
-        <w:gridCol w:w="1929"/>
-        <w:gridCol w:w="2447"/>
+        <w:gridCol w:w="2065"/>
+        <w:gridCol w:w="1697"/>
+        <w:gridCol w:w="1417"/>
+        <w:gridCol w:w="3759"/>
       </w:tblGrid>
       <w:tr>
         <w:trPr>
@@ -168,7 +169,7 @@
         </w:tc>
         <w:tc>
           <w:tcPr>
-            <w:tcW w:type="dxa" w:w="4562"/>
+            <w:tcW w:type="dxa" w:w="2065"/>
             <w:tcBorders>
               <w:top w:val="single" w:color="BFBFBF" w:sz="4"/>
               <w:left w:val="single" w:color="BFBFBF" w:sz="4"/>
@@ -202,7 +203,7 @@
         </w:tc>
         <w:tc>
           <w:tcPr>
-            <w:tcW w:type="dxa" w:w="1929"/>
+            <w:tcW w:type="dxa" w:w="1697"/>
             <w:tcBorders>
               <w:top w:val="single" w:color="BFBFBF" w:sz="4"/>
               <w:left w:val="single" w:color="BFBFBF" w:sz="4"/>
@@ -230,13 +231,47 @@
                 <w:sz w:val="16"/>
                 <w:szCs w:val="16"/>
               </w:rPr>
+              <w:t xml:space="preserve">Kaynak</w:t>
+            </w:r>
+          </w:p>
+        </w:tc>
+        <w:tc>
+          <w:tcPr>
+            <w:tcW w:type="dxa" w:w="1417"/>
+            <w:tcBorders>
+              <w:top w:val="single" w:color="BFBFBF" w:sz="4"/>
+              <w:left w:val="single" w:color="BFBFBF" w:sz="4"/>
+              <w:bottom w:val="single" w:color="BFBFBF" w:sz="4"/>
+              <w:right w:val="single" w:color="BFBFBF" w:sz="4"/>
+            </w:tcBorders>
+            <w:shd w:fill="D9E2F3" w:color="auto" w:val="clear"/>
+            <w:tcMar>
+              <w:top w:type="dxa" w:w="30"/>
+              <w:left w:type="dxa" w:w="80"/>
+              <w:bottom w:type="dxa" w:w="30"/>
+              <w:right w:type="dxa" w:w="80"/>
+            </w:tcMar>
+            <w:vAlign w:val="center"/>
+          </w:tcPr>
+          <w:p>
+            <w:pPr>
+              <w:keepNext/>
+              <w:spacing w:after="0" w:before="0" w:line="240" w:lineRule="auto"/>
+            </w:pPr>
+            <w:r>
+              <w:rPr>
+                <w:b/>
+                <w:bCs/>
+                <w:sz w:val="16"/>
+                <w:szCs w:val="16"/>
+              </w:rPr>
               <w:t xml:space="preserve">Kesit (mm)</w:t>
             </w:r>
           </w:p>
         </w:tc>
         <w:tc>
           <w:tcPr>
-            <w:tcW w:type="dxa" w:w="2447"/>
+            <w:tcW w:type="dxa" w:w="3759"/>
             <w:tcBorders>
               <w:top w:val="single" w:color="BFBFBF" w:sz="4"/>
               <w:left w:val="single" w:color="BFBFBF" w:sz="4"/>
@@ -308,7 +343,7 @@
         </w:tc>
         <w:tc>
           <w:tcPr>
-            <w:tcW w:type="dxa" w:w="4562"/>
+            <w:tcW w:type="dxa" w:w="2065"/>
             <w:tcBorders>
               <w:top w:val="single" w:color="BFBFBF" w:sz="4"/>
               <w:left w:val="single" w:color="BFBFBF" w:sz="4"/>
@@ -339,7 +374,38 @@
         </w:tc>
         <w:tc>
           <w:tcPr>
-            <w:tcW w:type="dxa" w:w="1929"/>
+            <w:tcW w:type="dxa" w:w="1697"/>
+            <w:tcBorders>
+              <w:top w:val="single" w:color="BFBFBF" w:sz="4"/>
+              <w:left w:val="single" w:color="BFBFBF" w:sz="4"/>
+              <w:bottom w:val="single" w:color="BFBFBF" w:sz="4"/>
+              <w:right w:val="single" w:color="BFBFBF" w:sz="4"/>
+            </w:tcBorders>
+            <w:tcMar>
+              <w:top w:type="dxa" w:w="30"/>
+              <w:left w:type="dxa" w:w="80"/>
+              <w:bottom w:type="dxa" w:w="30"/>
+              <w:right w:type="dxa" w:w="80"/>
+            </w:tcMar>
+            <w:vAlign w:val="top"/>
+          </w:tcPr>
+          <w:p>
+            <w:pPr>
+              <w:keepNext/>
+              <w:spacing w:after="0" w:before="0" w:line="240" w:lineRule="auto"/>
+            </w:pPr>
+            <w:r>
+              <w:rPr>
+                <w:sz w:val="16"/>
+                <w:szCs w:val="16"/>
+              </w:rPr>
+              <w:t xml:space="preserve">Stok, ~15 kg</w:t>
+            </w:r>
+          </w:p>
+        </w:tc>
+        <w:tc>
+          <w:tcPr>
+            <w:tcW w:type="dxa" w:w="1417"/>
             <w:tcBorders>
               <w:top w:val="single" w:color="BFBFBF" w:sz="4"/>
               <w:left w:val="single" w:color="BFBFBF" w:sz="4"/>
@@ -370,32 +436,32 @@
         </w:tc>
         <w:tc>
           <w:tcPr>
-            <w:tcW w:type="dxa" w:w="2447"/>
-            <w:tcBorders>
-              <w:top w:val="single" w:color="BFBFBF" w:sz="4"/>
-              <w:left w:val="single" w:color="BFBFBF" w:sz="4"/>
-              <w:bottom w:val="single" w:color="BFBFBF" w:sz="4"/>
-              <w:right w:val="single" w:color="BFBFBF" w:sz="4"/>
-            </w:tcBorders>
-            <w:tcMar>
-              <w:top w:type="dxa" w:w="30"/>
-              <w:left w:type="dxa" w:w="80"/>
-              <w:bottom w:type="dxa" w:w="30"/>
-              <w:right w:type="dxa" w:w="80"/>
-            </w:tcMar>
-            <w:vAlign w:val="top"/>
-          </w:tcPr>
-          <w:p>
-            <w:pPr>
-              <w:keepNext/>
-              <w:spacing w:after="0" w:before="0" w:line="240" w:lineRule="auto"/>
-            </w:pPr>
-            <w:r>
-              <w:rPr>
-                <w:sz w:val="16"/>
-                <w:szCs w:val="16"/>
-              </w:rPr>
-              <w:t xml:space="preserve">Stok</w:t>
+            <w:tcW w:type="dxa" w:w="3759"/>
+            <w:tcBorders>
+              <w:top w:val="single" w:color="BFBFBF" w:sz="4"/>
+              <w:left w:val="single" w:color="BFBFBF" w:sz="4"/>
+              <w:bottom w:val="single" w:color="BFBFBF" w:sz="4"/>
+              <w:right w:val="single" w:color="BFBFBF" w:sz="4"/>
+            </w:tcBorders>
+            <w:tcMar>
+              <w:top w:type="dxa" w:w="30"/>
+              <w:left w:type="dxa" w:w="80"/>
+              <w:bottom w:type="dxa" w:w="30"/>
+              <w:right w:type="dxa" w:w="80"/>
+            </w:tcMar>
+            <w:vAlign w:val="top"/>
+          </w:tcPr>
+          <w:p>
+            <w:pPr>
+              <w:keepNext/>
+              <w:spacing w:after="0" w:before="0" w:line="240" w:lineRule="auto"/>
+            </w:pPr>
+            <w:r>
+              <w:rPr>
+                <w:sz w:val="16"/>
+                <w:szCs w:val="16"/>
+              </w:rPr>
+              <w:t xml:space="preserve">—</w:t>
             </w:r>
           </w:p>
         </w:tc>
@@ -440,7 +506,7 @@
         </w:tc>
         <w:tc>
           <w:tcPr>
-            <w:tcW w:type="dxa" w:w="4562"/>
+            <w:tcW w:type="dxa" w:w="2065"/>
             <w:tcBorders>
               <w:top w:val="single" w:color="BFBFBF" w:sz="4"/>
               <w:left w:val="single" w:color="BFBFBF" w:sz="4"/>
@@ -472,7 +538,7 @@
         </w:tc>
         <w:tc>
           <w:tcPr>
-            <w:tcW w:type="dxa" w:w="1929"/>
+            <w:tcW w:type="dxa" w:w="1697"/>
             <w:tcBorders>
               <w:top w:val="single" w:color="BFBFBF" w:sz="4"/>
               <w:left w:val="single" w:color="BFBFBF" w:sz="4"/>
@@ -498,13 +564,45 @@
                 <w:sz w:val="16"/>
                 <w:szCs w:val="16"/>
               </w:rPr>
+              <w:t xml:space="preserve">Stok, 4 kg</w:t>
+            </w:r>
+          </w:p>
+        </w:tc>
+        <w:tc>
+          <w:tcPr>
+            <w:tcW w:type="dxa" w:w="1417"/>
+            <w:tcBorders>
+              <w:top w:val="single" w:color="BFBFBF" w:sz="4"/>
+              <w:left w:val="single" w:color="BFBFBF" w:sz="4"/>
+              <w:bottom w:val="single" w:color="BFBFBF" w:sz="4"/>
+              <w:right w:val="single" w:color="BFBFBF" w:sz="4"/>
+            </w:tcBorders>
+            <w:shd w:fill="F5F7FB" w:color="auto" w:val="clear"/>
+            <w:tcMar>
+              <w:top w:type="dxa" w:w="30"/>
+              <w:left w:type="dxa" w:w="80"/>
+              <w:bottom w:type="dxa" w:w="30"/>
+              <w:right w:type="dxa" w:w="80"/>
+            </w:tcMar>
+            <w:vAlign w:val="top"/>
+          </w:tcPr>
+          <w:p>
+            <w:pPr>
+              <w:keepNext/>
+              <w:spacing w:after="0" w:before="0" w:line="240" w:lineRule="auto"/>
+            </w:pPr>
+            <w:r>
+              <w:rPr>
+                <w:sz w:val="16"/>
+                <w:szCs w:val="16"/>
+              </w:rPr>
               <w:t xml:space="preserve">4,35 × 2,10</w:t>
             </w:r>
           </w:p>
         </w:tc>
         <w:tc>
           <w:tcPr>
-            <w:tcW w:type="dxa" w:w="2447"/>
+            <w:tcW w:type="dxa" w:w="3759"/>
             <w:tcBorders>
               <w:top w:val="single" w:color="BFBFBF" w:sz="4"/>
               <w:left w:val="single" w:color="BFBFBF" w:sz="4"/>
@@ -530,7 +628,7 @@
                 <w:sz w:val="16"/>
                 <w:szCs w:val="16"/>
               </w:rPr>
-              <w:t xml:space="preserve">Stok (4 kg)</w:t>
+              <w:t xml:space="preserve">≈49 m; plan için yeterli</w:t>
             </w:r>
           </w:p>
         </w:tc>
@@ -574,7 +672,7 @@
         </w:tc>
         <w:tc>
           <w:tcPr>
-            <w:tcW w:type="dxa" w:w="4562"/>
+            <w:tcW w:type="dxa" w:w="2065"/>
             <w:tcBorders>
               <w:top w:val="single" w:color="BFBFBF" w:sz="4"/>
               <w:left w:val="single" w:color="BFBFBF" w:sz="4"/>
@@ -605,7 +703,38 @@
         </w:tc>
         <w:tc>
           <w:tcPr>
-            <w:tcW w:type="dxa" w:w="1929"/>
+            <w:tcW w:type="dxa" w:w="1697"/>
+            <w:tcBorders>
+              <w:top w:val="single" w:color="BFBFBF" w:sz="4"/>
+              <w:left w:val="single" w:color="BFBFBF" w:sz="4"/>
+              <w:bottom w:val="single" w:color="BFBFBF" w:sz="4"/>
+              <w:right w:val="single" w:color="BFBFBF" w:sz="4"/>
+            </w:tcBorders>
+            <w:tcMar>
+              <w:top w:type="dxa" w:w="30"/>
+              <w:left w:type="dxa" w:w="80"/>
+              <w:bottom w:type="dxa" w:w="30"/>
+              <w:right w:type="dxa" w:w="80"/>
+            </w:tcMar>
+            <w:vAlign w:val="top"/>
+          </w:tcPr>
+          <w:p>
+            <w:pPr>
+              <w:keepNext/>
+              <w:spacing w:after="0" w:before="0" w:line="240" w:lineRule="auto"/>
+            </w:pPr>
+            <w:r>
+              <w:rPr>
+                <w:sz w:val="16"/>
+                <w:szCs w:val="16"/>
+              </w:rPr>
+              <w:t xml:space="preserve">Stok, 29 kg</w:t>
+            </w:r>
+          </w:p>
+        </w:tc>
+        <w:tc>
+          <w:tcPr>
+            <w:tcW w:type="dxa" w:w="1417"/>
             <w:tcBorders>
               <w:top w:val="single" w:color="BFBFBF" w:sz="4"/>
               <w:left w:val="single" w:color="BFBFBF" w:sz="4"/>
@@ -636,32 +765,32 @@
         </w:tc>
         <w:tc>
           <w:tcPr>
-            <w:tcW w:type="dxa" w:w="2447"/>
-            <w:tcBorders>
-              <w:top w:val="single" w:color="BFBFBF" w:sz="4"/>
-              <w:left w:val="single" w:color="BFBFBF" w:sz="4"/>
-              <w:bottom w:val="single" w:color="BFBFBF" w:sz="4"/>
-              <w:right w:val="single" w:color="BFBFBF" w:sz="4"/>
-            </w:tcBorders>
-            <w:tcMar>
-              <w:top w:type="dxa" w:w="30"/>
-              <w:left w:type="dxa" w:w="80"/>
-              <w:bottom w:type="dxa" w:w="30"/>
-              <w:right w:type="dxa" w:w="80"/>
-            </w:tcMar>
-            <w:vAlign w:val="top"/>
-          </w:tcPr>
-          <w:p>
-            <w:pPr>
-              <w:keepNext/>
-              <w:spacing w:after="0" w:before="0" w:line="240" w:lineRule="auto"/>
-            </w:pPr>
-            <w:r>
-              <w:rPr>
-                <w:sz w:val="16"/>
-                <w:szCs w:val="16"/>
-              </w:rPr>
-              <w:t xml:space="preserve">Stok</w:t>
+            <w:tcW w:type="dxa" w:w="3759"/>
+            <w:tcBorders>
+              <w:top w:val="single" w:color="BFBFBF" w:sz="4"/>
+              <w:left w:val="single" w:color="BFBFBF" w:sz="4"/>
+              <w:bottom w:val="single" w:color="BFBFBF" w:sz="4"/>
+              <w:right w:val="single" w:color="BFBFBF" w:sz="4"/>
+            </w:tcBorders>
+            <w:tcMar>
+              <w:top w:type="dxa" w:w="30"/>
+              <w:left w:type="dxa" w:w="80"/>
+              <w:bottom w:type="dxa" w:w="30"/>
+              <w:right w:type="dxa" w:w="80"/>
+            </w:tcMar>
+            <w:vAlign w:val="top"/>
+          </w:tcPr>
+          <w:p>
+            <w:pPr>
+              <w:keepNext/>
+              <w:spacing w:after="0" w:before="0" w:line="240" w:lineRule="auto"/>
+            </w:pPr>
+            <w:r>
+              <w:rPr>
+                <w:sz w:val="16"/>
+                <w:szCs w:val="16"/>
+              </w:rPr>
+              <w:t xml:space="preserve">—</w:t>
             </w:r>
           </w:p>
         </w:tc>
@@ -706,7 +835,7 @@
         </w:tc>
         <w:tc>
           <w:tcPr>
-            <w:tcW w:type="dxa" w:w="4562"/>
+            <w:tcW w:type="dxa" w:w="2065"/>
             <w:tcBorders>
               <w:top w:val="single" w:color="BFBFBF" w:sz="4"/>
               <w:left w:val="single" w:color="BFBFBF" w:sz="4"/>
@@ -738,7 +867,7 @@
         </w:tc>
         <w:tc>
           <w:tcPr>
-            <w:tcW w:type="dxa" w:w="1929"/>
+            <w:tcW w:type="dxa" w:w="1697"/>
             <w:tcBorders>
               <w:top w:val="single" w:color="BFBFBF" w:sz="4"/>
               <w:left w:val="single" w:color="BFBFBF" w:sz="4"/>
@@ -764,13 +893,45 @@
                 <w:sz w:val="16"/>
                 <w:szCs w:val="16"/>
               </w:rPr>
+              <w:t xml:space="preserve">Stok, 100 kg</w:t>
+            </w:r>
+          </w:p>
+        </w:tc>
+        <w:tc>
+          <w:tcPr>
+            <w:tcW w:type="dxa" w:w="1417"/>
+            <w:tcBorders>
+              <w:top w:val="single" w:color="BFBFBF" w:sz="4"/>
+              <w:left w:val="single" w:color="BFBFBF" w:sz="4"/>
+              <w:bottom w:val="single" w:color="BFBFBF" w:sz="4"/>
+              <w:right w:val="single" w:color="BFBFBF" w:sz="4"/>
+            </w:tcBorders>
+            <w:shd w:fill="F5F7FB" w:color="auto" w:val="clear"/>
+            <w:tcMar>
+              <w:top w:type="dxa" w:w="30"/>
+              <w:left w:type="dxa" w:w="80"/>
+              <w:bottom w:type="dxa" w:w="30"/>
+              <w:right w:type="dxa" w:w="80"/>
+            </w:tcMar>
+            <w:vAlign w:val="top"/>
+          </w:tcPr>
+          <w:p>
+            <w:pPr>
+              <w:keepNext/>
+              <w:spacing w:after="0" w:before="0" w:line="240" w:lineRule="auto"/>
+            </w:pPr>
+            <w:r>
+              <w:rPr>
+                <w:sz w:val="16"/>
+                <w:szCs w:val="16"/>
+              </w:rPr>
               <w:t xml:space="preserve">5,60 × 2,25</w:t>
             </w:r>
           </w:p>
         </w:tc>
         <w:tc>
           <w:tcPr>
-            <w:tcW w:type="dxa" w:w="2447"/>
+            <w:tcW w:type="dxa" w:w="3759"/>
             <w:tcBorders>
               <w:top w:val="single" w:color="BFBFBF" w:sz="4"/>
               <w:left w:val="single" w:color="BFBFBF" w:sz="4"/>
@@ -796,7 +957,7 @@
                 <w:sz w:val="16"/>
                 <w:szCs w:val="16"/>
               </w:rPr>
-              <w:t xml:space="preserve">Stok; kesit farklı</w:t>
+              <w:t xml:space="preserve">Kesit farklı</w:t>
             </w:r>
           </w:p>
         </w:tc>
@@ -840,38 +1001,69 @@
         </w:tc>
         <w:tc>
           <w:tcPr>
-            <w:tcW w:type="dxa" w:w="4562"/>
-            <w:tcBorders>
-              <w:top w:val="single" w:color="BFBFBF" w:sz="4"/>
-              <w:left w:val="single" w:color="BFBFBF" w:sz="4"/>
-              <w:bottom w:val="single" w:color="BFBFBF" w:sz="4"/>
-              <w:right w:val="single" w:color="BFBFBF" w:sz="4"/>
-            </w:tcBorders>
-            <w:tcMar>
-              <w:top w:type="dxa" w:w="30"/>
-              <w:left w:type="dxa" w:w="80"/>
-              <w:bottom w:type="dxa" w:w="30"/>
-              <w:right w:type="dxa" w:w="80"/>
-            </w:tcMar>
-            <w:vAlign w:val="top"/>
-          </w:tcPr>
-          <w:p>
-            <w:pPr>
-              <w:keepNext/>
-              <w:spacing w:after="0" w:before="0" w:line="240" w:lineRule="auto"/>
-            </w:pPr>
-            <w:r>
-              <w:rPr>
-                <w:sz w:val="16"/>
-                <w:szCs w:val="16"/>
-              </w:rPr>
-              <w:t xml:space="preserve">Folyo + cam (opsiyonel)</w:t>
-            </w:r>
-          </w:p>
-        </w:tc>
-        <w:tc>
-          <w:tcPr>
-            <w:tcW w:type="dxa" w:w="1929"/>
+            <w:tcW w:type="dxa" w:w="2065"/>
+            <w:tcBorders>
+              <w:top w:val="single" w:color="BFBFBF" w:sz="4"/>
+              <w:left w:val="single" w:color="BFBFBF" w:sz="4"/>
+              <w:bottom w:val="single" w:color="BFBFBF" w:sz="4"/>
+              <w:right w:val="single" w:color="BFBFBF" w:sz="4"/>
+            </w:tcBorders>
+            <w:tcMar>
+              <w:top w:type="dxa" w:w="30"/>
+              <w:left w:type="dxa" w:w="80"/>
+              <w:bottom w:type="dxa" w:w="30"/>
+              <w:right w:type="dxa" w:w="80"/>
+            </w:tcMar>
+            <w:vAlign w:val="top"/>
+          </w:tcPr>
+          <w:p>
+            <w:pPr>
+              <w:keepNext/>
+              <w:spacing w:after="0" w:before="0" w:line="240" w:lineRule="auto"/>
+            </w:pPr>
+            <w:r>
+              <w:rPr>
+                <w:sz w:val="16"/>
+                <w:szCs w:val="16"/>
+              </w:rPr>
+              <w:t xml:space="preserve">Folyo + cam</w:t>
+            </w:r>
+          </w:p>
+        </w:tc>
+        <w:tc>
+          <w:tcPr>
+            <w:tcW w:type="dxa" w:w="1697"/>
+            <w:tcBorders>
+              <w:top w:val="single" w:color="BFBFBF" w:sz="4"/>
+              <w:left w:val="single" w:color="BFBFBF" w:sz="4"/>
+              <w:bottom w:val="single" w:color="BFBFBF" w:sz="4"/>
+              <w:right w:val="single" w:color="BFBFBF" w:sz="4"/>
+            </w:tcBorders>
+            <w:tcMar>
+              <w:top w:type="dxa" w:w="30"/>
+              <w:left w:type="dxa" w:w="80"/>
+              <w:bottom w:type="dxa" w:w="30"/>
+              <w:right w:type="dxa" w:w="80"/>
+            </w:tcMar>
+            <w:vAlign w:val="top"/>
+          </w:tcPr>
+          <w:p>
+            <w:pPr>
+              <w:keepNext/>
+              <w:spacing w:after="0" w:before="0" w:line="240" w:lineRule="auto"/>
+            </w:pPr>
+            <w:r>
+              <w:rPr>
+                <w:sz w:val="16"/>
+                <w:szCs w:val="16"/>
+              </w:rPr>
+              <w:t xml:space="preserve">Stok, 52 kg</w:t>
+            </w:r>
+          </w:p>
+        </w:tc>
+        <w:tc>
+          <w:tcPr>
+            <w:tcW w:type="dxa" w:w="1417"/>
             <w:tcBorders>
               <w:top w:val="single" w:color="BFBFBF" w:sz="4"/>
               <w:left w:val="single" w:color="BFBFBF" w:sz="4"/>
@@ -902,32 +1094,32 @@
         </w:tc>
         <w:tc>
           <w:tcPr>
-            <w:tcW w:type="dxa" w:w="2447"/>
-            <w:tcBorders>
-              <w:top w:val="single" w:color="BFBFBF" w:sz="4"/>
-              <w:left w:val="single" w:color="BFBFBF" w:sz="4"/>
-              <w:bottom w:val="single" w:color="BFBFBF" w:sz="4"/>
-              <w:right w:val="single" w:color="BFBFBF" w:sz="4"/>
-            </w:tcBorders>
-            <w:tcMar>
-              <w:top w:type="dxa" w:w="30"/>
-              <w:left w:type="dxa" w:w="80"/>
-              <w:bottom w:type="dxa" w:w="30"/>
-              <w:right w:type="dxa" w:w="80"/>
-            </w:tcMar>
-            <w:vAlign w:val="top"/>
-          </w:tcPr>
-          <w:p>
-            <w:pPr>
-              <w:keepNext/>
-              <w:spacing w:after="0" w:before="0" w:line="240" w:lineRule="auto"/>
-            </w:pPr>
-            <w:r>
-              <w:rPr>
-                <w:sz w:val="16"/>
-                <w:szCs w:val="16"/>
-              </w:rPr>
-              <w:t xml:space="preserve">Stok</w:t>
+            <w:tcW w:type="dxa" w:w="3759"/>
+            <w:tcBorders>
+              <w:top w:val="single" w:color="BFBFBF" w:sz="4"/>
+              <w:left w:val="single" w:color="BFBFBF" w:sz="4"/>
+              <w:bottom w:val="single" w:color="BFBFBF" w:sz="4"/>
+              <w:right w:val="single" w:color="BFBFBF" w:sz="4"/>
+            </w:tcBorders>
+            <w:tcMar>
+              <w:top w:type="dxa" w:w="30"/>
+              <w:left w:type="dxa" w:w="80"/>
+              <w:bottom w:type="dxa" w:w="30"/>
+              <w:right w:type="dxa" w:w="80"/>
+            </w:tcMar>
+            <w:vAlign w:val="top"/>
+          </w:tcPr>
+          <w:p>
+            <w:pPr>
+              <w:keepNext/>
+              <w:spacing w:after="0" w:before="0" w:line="240" w:lineRule="auto"/>
+            </w:pPr>
+            <w:r>
+              <w:rPr>
+                <w:sz w:val="16"/>
+                <w:szCs w:val="16"/>
+              </w:rPr>
+              <w:t xml:space="preserve">Opsiyonel; kesit farklı</w:t>
             </w:r>
           </w:p>
         </w:tc>
@@ -956,7 +1148,7 @@
           </w:tcPr>
           <w:p>
             <w:pPr>
-              <w:keepNext w:val="false"/>
+              <w:keepNext/>
               <w:spacing w:after="0" w:before="0" w:line="240" w:lineRule="auto"/>
             </w:pPr>
             <w:r>
@@ -966,13 +1158,13 @@
                 <w:sz w:val="16"/>
                 <w:szCs w:val="16"/>
               </w:rPr>
-              <w:t xml:space="preserve">B grubu</w:t>
-            </w:r>
-          </w:p>
-        </w:tc>
-        <w:tc>
-          <w:tcPr>
-            <w:tcW w:type="dxa" w:w="4562"/>
+              <w:t xml:space="preserve">PX</w:t>
+            </w:r>
+          </w:p>
+        </w:tc>
+        <w:tc>
+          <w:tcPr>
+            <w:tcW w:type="dxa" w:w="2065"/>
             <w:tcBorders>
               <w:top w:val="single" w:color="BFBFBF" w:sz="4"/>
               <w:left w:val="single" w:color="BFBFBF" w:sz="4"/>
@@ -990,21 +1182,647 @@
           </w:tcPr>
           <w:p>
             <w:pPr>
+              <w:keepNext/>
+              <w:spacing w:after="0" w:before="0" w:line="240" w:lineRule="auto"/>
+            </w:pPr>
+            <w:r>
+              <w:rPr>
+                <w:sz w:val="16"/>
+                <w:szCs w:val="16"/>
+              </w:rPr>
+              <w:t xml:space="preserve">Ekstrüde PEEK</w:t>
+            </w:r>
+          </w:p>
+        </w:tc>
+        <w:tc>
+          <w:tcPr>
+            <w:tcW w:type="dxa" w:w="1697"/>
+            <w:tcBorders>
+              <w:top w:val="single" w:color="BFBFBF" w:sz="4"/>
+              <w:left w:val="single" w:color="BFBFBF" w:sz="4"/>
+              <w:bottom w:val="single" w:color="BFBFBF" w:sz="4"/>
+              <w:right w:val="single" w:color="BFBFBF" w:sz="4"/>
+            </w:tcBorders>
+            <w:shd w:fill="F5F7FB" w:color="auto" w:val="clear"/>
+            <w:tcMar>
+              <w:top w:type="dxa" w:w="30"/>
+              <w:left w:type="dxa" w:w="80"/>
+              <w:bottom w:type="dxa" w:w="30"/>
+              <w:right w:type="dxa" w:w="80"/>
+            </w:tcMar>
+            <w:vAlign w:val="top"/>
+          </w:tcPr>
+          <w:p>
+            <w:pPr>
+              <w:keepNext/>
+              <w:spacing w:after="0" w:before="0" w:line="240" w:lineRule="auto"/>
+            </w:pPr>
+            <w:r>
+              <w:rPr>
+                <w:sz w:val="16"/>
+                <w:szCs w:val="16"/>
+              </w:rPr>
+              <w:t xml:space="preserve">Talep: tedarik</w:t>
+            </w:r>
+          </w:p>
+        </w:tc>
+        <w:tc>
+          <w:tcPr>
+            <w:tcW w:type="dxa" w:w="1417"/>
+            <w:tcBorders>
+              <w:top w:val="single" w:color="BFBFBF" w:sz="4"/>
+              <w:left w:val="single" w:color="BFBFBF" w:sz="4"/>
+              <w:bottom w:val="single" w:color="BFBFBF" w:sz="4"/>
+              <w:right w:val="single" w:color="BFBFBF" w:sz="4"/>
+            </w:tcBorders>
+            <w:shd w:fill="F5F7FB" w:color="auto" w:val="clear"/>
+            <w:tcMar>
+              <w:top w:type="dxa" w:w="30"/>
+              <w:left w:type="dxa" w:w="80"/>
+              <w:bottom w:type="dxa" w:w="30"/>
+              <w:right w:type="dxa" w:w="80"/>
+            </w:tcMar>
+            <w:vAlign w:val="top"/>
+          </w:tcPr>
+          <w:p>
+            <w:pPr>
+              <w:keepNext/>
+              <w:spacing w:after="0" w:before="0" w:line="240" w:lineRule="auto"/>
+            </w:pPr>
+            <w:r>
+              <w:rPr>
+                <w:sz w:val="16"/>
+                <w:szCs w:val="16"/>
+              </w:rPr>
+              <w:t xml:space="preserve">4,35 × 2,10</w:t>
+            </w:r>
+          </w:p>
+        </w:tc>
+        <w:tc>
+          <w:tcPr>
+            <w:tcW w:type="dxa" w:w="3759"/>
+            <w:tcBorders>
+              <w:top w:val="single" w:color="BFBFBF" w:sz="4"/>
+              <w:left w:val="single" w:color="BFBFBF" w:sz="4"/>
+              <w:bottom w:val="single" w:color="BFBFBF" w:sz="4"/>
+              <w:right w:val="single" w:color="BFBFBF" w:sz="4"/>
+            </w:tcBorders>
+            <w:shd w:fill="F5F7FB" w:color="auto" w:val="clear"/>
+            <w:tcMar>
+              <w:top w:type="dxa" w:w="30"/>
+              <w:left w:type="dxa" w:w="80"/>
+              <w:bottom w:type="dxa" w:w="30"/>
+              <w:right w:type="dxa" w:w="80"/>
+            </w:tcMar>
+            <w:vAlign w:val="top"/>
+          </w:tcPr>
+          <w:p>
+            <w:pPr>
+              <w:keepNext/>
+              <w:spacing w:after="0" w:before="0" w:line="240" w:lineRule="auto"/>
+            </w:pPr>
+            <w:r>
+              <w:rPr>
+                <w:sz w:val="16"/>
+                <w:szCs w:val="16"/>
+              </w:rPr>
+              <w:t xml:space="preserve">Yalıtım kalınlığı ve sınıfı üretici verisiyle</w:t>
+            </w:r>
+          </w:p>
+        </w:tc>
+      </w:tr>
+      <w:tr>
+        <w:trPr>
+          <w:cantSplit/>
+        </w:trPr>
+        <w:tc>
+          <w:tcPr>
+            <w:tcW w:type="dxa" w:w="700"/>
+            <w:tcBorders>
+              <w:top w:val="single" w:color="BFBFBF" w:sz="4"/>
+              <w:left w:val="single" w:color="BFBFBF" w:sz="4"/>
+              <w:bottom w:val="single" w:color="BFBFBF" w:sz="4"/>
+              <w:right w:val="single" w:color="BFBFBF" w:sz="4"/>
+            </w:tcBorders>
+            <w:tcMar>
+              <w:top w:type="dxa" w:w="30"/>
+              <w:left w:type="dxa" w:w="80"/>
+              <w:bottom w:type="dxa" w:w="30"/>
+              <w:right w:type="dxa" w:w="80"/>
+            </w:tcMar>
+            <w:vAlign w:val="top"/>
+          </w:tcPr>
+          <w:p>
+            <w:pPr>
+              <w:keepNext/>
+              <w:spacing w:after="0" w:before="0" w:line="240" w:lineRule="auto"/>
+            </w:pPr>
+            <w:r>
+              <w:rPr>
+                <w:b/>
+                <w:bCs/>
+                <w:sz w:val="16"/>
+                <w:szCs w:val="16"/>
+              </w:rPr>
+              <w:t xml:space="preserve">PT</w:t>
+            </w:r>
+          </w:p>
+        </w:tc>
+        <w:tc>
+          <w:tcPr>
+            <w:tcW w:type="dxa" w:w="2065"/>
+            <w:tcBorders>
+              <w:top w:val="single" w:color="BFBFBF" w:sz="4"/>
+              <w:left w:val="single" w:color="BFBFBF" w:sz="4"/>
+              <w:bottom w:val="single" w:color="BFBFBF" w:sz="4"/>
+              <w:right w:val="single" w:color="BFBFBF" w:sz="4"/>
+            </w:tcBorders>
+            <w:tcMar>
+              <w:top w:type="dxa" w:w="30"/>
+              <w:left w:type="dxa" w:w="80"/>
+              <w:bottom w:type="dxa" w:w="30"/>
+              <w:right w:type="dxa" w:w="80"/>
+            </w:tcMar>
+            <w:vAlign w:val="top"/>
+          </w:tcPr>
+          <w:p>
+            <w:pPr>
+              <w:keepNext/>
+              <w:spacing w:after="0" w:before="0" w:line="240" w:lineRule="auto"/>
+            </w:pPr>
+            <w:r>
+              <w:rPr>
+                <w:sz w:val="16"/>
+                <w:szCs w:val="16"/>
+              </w:rPr>
+              <w:t xml:space="preserve">PEEK tüp</w:t>
+            </w:r>
+          </w:p>
+        </w:tc>
+        <w:tc>
+          <w:tcPr>
+            <w:tcW w:type="dxa" w:w="1697"/>
+            <w:tcBorders>
+              <w:top w:val="single" w:color="BFBFBF" w:sz="4"/>
+              <w:left w:val="single" w:color="BFBFBF" w:sz="4"/>
+              <w:bottom w:val="single" w:color="BFBFBF" w:sz="4"/>
+              <w:right w:val="single" w:color="BFBFBF" w:sz="4"/>
+            </w:tcBorders>
+            <w:tcMar>
+              <w:top w:type="dxa" w:w="30"/>
+              <w:left w:type="dxa" w:w="80"/>
+              <w:bottom w:type="dxa" w:w="30"/>
+              <w:right w:type="dxa" w:w="80"/>
+            </w:tcMar>
+            <w:vAlign w:val="top"/>
+          </w:tcPr>
+          <w:p>
+            <w:pPr>
+              <w:keepNext/>
+              <w:spacing w:after="0" w:before="0" w:line="240" w:lineRule="auto"/>
+            </w:pPr>
+            <w:r>
+              <w:rPr>
+                <w:sz w:val="16"/>
+                <w:szCs w:val="16"/>
+              </w:rPr>
+              <w:t xml:space="preserve">Talep: tüp</w:t>
+            </w:r>
+          </w:p>
+        </w:tc>
+        <w:tc>
+          <w:tcPr>
+            <w:tcW w:type="dxa" w:w="1417"/>
+            <w:tcBorders>
+              <w:top w:val="single" w:color="BFBFBF" w:sz="4"/>
+              <w:left w:val="single" w:color="BFBFBF" w:sz="4"/>
+              <w:bottom w:val="single" w:color="BFBFBF" w:sz="4"/>
+              <w:right w:val="single" w:color="BFBFBF" w:sz="4"/>
+            </w:tcBorders>
+            <w:tcMar>
+              <w:top w:type="dxa" w:w="30"/>
+              <w:left w:type="dxa" w:w="80"/>
+              <w:bottom w:type="dxa" w:w="30"/>
+              <w:right w:type="dxa" w:w="80"/>
+            </w:tcMar>
+            <w:vAlign w:val="top"/>
+          </w:tcPr>
+          <w:p>
+            <w:pPr>
+              <w:keepNext/>
+              <w:spacing w:after="0" w:before="0" w:line="240" w:lineRule="auto"/>
+            </w:pPr>
+            <w:r>
+              <w:rPr>
+                <w:sz w:val="16"/>
+                <w:szCs w:val="16"/>
+              </w:rPr>
+              <w:t xml:space="preserve">4,35 × 2,10</w:t>
+            </w:r>
+          </w:p>
+        </w:tc>
+        <w:tc>
+          <w:tcPr>
+            <w:tcW w:type="dxa" w:w="3759"/>
+            <w:tcBorders>
+              <w:top w:val="single" w:color="BFBFBF" w:sz="4"/>
+              <w:left w:val="single" w:color="BFBFBF" w:sz="4"/>
+              <w:bottom w:val="single" w:color="BFBFBF" w:sz="4"/>
+              <w:right w:val="single" w:color="BFBFBF" w:sz="4"/>
+            </w:tcBorders>
+            <w:tcMar>
+              <w:top w:type="dxa" w:w="30"/>
+              <w:left w:type="dxa" w:w="80"/>
+              <w:bottom w:type="dxa" w:w="30"/>
+              <w:right w:type="dxa" w:w="80"/>
+            </w:tcMar>
+            <w:vAlign w:val="top"/>
+          </w:tcPr>
+          <w:p>
+            <w:pPr>
+              <w:keepNext/>
+              <w:spacing w:after="0" w:before="0" w:line="240" w:lineRule="auto"/>
+            </w:pPr>
+            <w:r>
+              <w:rPr>
+                <w:sz w:val="16"/>
+                <w:szCs w:val="16"/>
+              </w:rPr>
+              <w:t xml:space="preserve">Çıplak bakıra geçirilir; hava boşluğu kontrol edilir</w:t>
+            </w:r>
+          </w:p>
+        </w:tc>
+      </w:tr>
+      <w:tr>
+        <w:trPr>
+          <w:cantSplit/>
+        </w:trPr>
+        <w:tc>
+          <w:tcPr>
+            <w:tcW w:type="dxa" w:w="700"/>
+            <w:tcBorders>
+              <w:top w:val="single" w:color="BFBFBF" w:sz="4"/>
+              <w:left w:val="single" w:color="BFBFBF" w:sz="4"/>
+              <w:bottom w:val="single" w:color="BFBFBF" w:sz="4"/>
+              <w:right w:val="single" w:color="BFBFBF" w:sz="4"/>
+            </w:tcBorders>
+            <w:shd w:fill="F5F7FB" w:color="auto" w:val="clear"/>
+            <w:tcMar>
+              <w:top w:type="dxa" w:w="30"/>
+              <w:left w:type="dxa" w:w="80"/>
+              <w:bottom w:type="dxa" w:w="30"/>
+              <w:right w:type="dxa" w:w="80"/>
+            </w:tcMar>
+            <w:vAlign w:val="top"/>
+          </w:tcPr>
+          <w:p>
+            <w:pPr>
+              <w:keepNext/>
+              <w:spacing w:after="0" w:before="0" w:line="240" w:lineRule="auto"/>
+            </w:pPr>
+            <w:r>
+              <w:rPr>
+                <w:b/>
+                <w:bCs/>
+                <w:sz w:val="16"/>
+                <w:szCs w:val="16"/>
+              </w:rPr>
+              <w:t xml:space="preserve">PS</w:t>
+            </w:r>
+          </w:p>
+        </w:tc>
+        <w:tc>
+          <w:tcPr>
+            <w:tcW w:type="dxa" w:w="2065"/>
+            <w:tcBorders>
+              <w:top w:val="single" w:color="BFBFBF" w:sz="4"/>
+              <w:left w:val="single" w:color="BFBFBF" w:sz="4"/>
+              <w:bottom w:val="single" w:color="BFBFBF" w:sz="4"/>
+              <w:right w:val="single" w:color="BFBFBF" w:sz="4"/>
+            </w:tcBorders>
+            <w:shd w:fill="F5F7FB" w:color="auto" w:val="clear"/>
+            <w:tcMar>
+              <w:top w:type="dxa" w:w="30"/>
+              <w:left w:type="dxa" w:w="80"/>
+              <w:bottom w:type="dxa" w:w="30"/>
+              <w:right w:type="dxa" w:w="80"/>
+            </w:tcMar>
+            <w:vAlign w:val="top"/>
+          </w:tcPr>
+          <w:p>
+            <w:pPr>
+              <w:keepNext/>
+              <w:spacing w:after="0" w:before="0" w:line="240" w:lineRule="auto"/>
+            </w:pPr>
+            <w:r>
+              <w:rPr>
+                <w:sz w:val="16"/>
+                <w:szCs w:val="16"/>
+              </w:rPr>
+              <w:t xml:space="preserve">PEEK ısıyla büzüşen makaron</w:t>
+            </w:r>
+          </w:p>
+        </w:tc>
+        <w:tc>
+          <w:tcPr>
+            <w:tcW w:type="dxa" w:w="1697"/>
+            <w:tcBorders>
+              <w:top w:val="single" w:color="BFBFBF" w:sz="4"/>
+              <w:left w:val="single" w:color="BFBFBF" w:sz="4"/>
+              <w:bottom w:val="single" w:color="BFBFBF" w:sz="4"/>
+              <w:right w:val="single" w:color="BFBFBF" w:sz="4"/>
+            </w:tcBorders>
+            <w:shd w:fill="F5F7FB" w:color="auto" w:val="clear"/>
+            <w:tcMar>
+              <w:top w:type="dxa" w:w="30"/>
+              <w:left w:type="dxa" w:w="80"/>
+              <w:bottom w:type="dxa" w:w="30"/>
+              <w:right w:type="dxa" w:w="80"/>
+            </w:tcMar>
+            <w:vAlign w:val="top"/>
+          </w:tcPr>
+          <w:p>
+            <w:pPr>
+              <w:keepNext/>
+              <w:spacing w:after="0" w:before="0" w:line="240" w:lineRule="auto"/>
+            </w:pPr>
+            <w:r>
+              <w:rPr>
+                <w:sz w:val="16"/>
+                <w:szCs w:val="16"/>
+              </w:rPr>
+              <w:t xml:space="preserve">Talep: makaron</w:t>
+            </w:r>
+          </w:p>
+        </w:tc>
+        <w:tc>
+          <w:tcPr>
+            <w:tcW w:type="dxa" w:w="1417"/>
+            <w:tcBorders>
+              <w:top w:val="single" w:color="BFBFBF" w:sz="4"/>
+              <w:left w:val="single" w:color="BFBFBF" w:sz="4"/>
+              <w:bottom w:val="single" w:color="BFBFBF" w:sz="4"/>
+              <w:right w:val="single" w:color="BFBFBF" w:sz="4"/>
+            </w:tcBorders>
+            <w:shd w:fill="F5F7FB" w:color="auto" w:val="clear"/>
+            <w:tcMar>
+              <w:top w:type="dxa" w:w="30"/>
+              <w:left w:type="dxa" w:w="80"/>
+              <w:bottom w:type="dxa" w:w="30"/>
+              <w:right w:type="dxa" w:w="80"/>
+            </w:tcMar>
+            <w:vAlign w:val="top"/>
+          </w:tcPr>
+          <w:p>
+            <w:pPr>
+              <w:keepNext/>
+              <w:spacing w:after="0" w:before="0" w:line="240" w:lineRule="auto"/>
+            </w:pPr>
+            <w:r>
+              <w:rPr>
+                <w:sz w:val="16"/>
+                <w:szCs w:val="16"/>
+              </w:rPr>
+              <w:t xml:space="preserve">4,35 × 2,10</w:t>
+            </w:r>
+          </w:p>
+        </w:tc>
+        <w:tc>
+          <w:tcPr>
+            <w:tcW w:type="dxa" w:w="3759"/>
+            <w:tcBorders>
+              <w:top w:val="single" w:color="BFBFBF" w:sz="4"/>
+              <w:left w:val="single" w:color="BFBFBF" w:sz="4"/>
+              <w:bottom w:val="single" w:color="BFBFBF" w:sz="4"/>
+              <w:right w:val="single" w:color="BFBFBF" w:sz="4"/>
+            </w:tcBorders>
+            <w:shd w:fill="F5F7FB" w:color="auto" w:val="clear"/>
+            <w:tcMar>
+              <w:top w:type="dxa" w:w="30"/>
+              <w:left w:type="dxa" w:w="80"/>
+              <w:bottom w:type="dxa" w:w="30"/>
+              <w:right w:type="dxa" w:w="80"/>
+            </w:tcMar>
+            <w:vAlign w:val="top"/>
+          </w:tcPr>
+          <w:p>
+            <w:pPr>
+              <w:keepNext/>
+              <w:spacing w:after="0" w:before="0" w:line="240" w:lineRule="auto"/>
+            </w:pPr>
+            <w:r>
+              <w:rPr>
+                <w:sz w:val="16"/>
+                <w:szCs w:val="16"/>
+              </w:rPr>
+              <w:t xml:space="preserve">Çıplak bakıra büzülür; hava boşluğu kontrol edilir</w:t>
+            </w:r>
+          </w:p>
+        </w:tc>
+      </w:tr>
+      <w:tr>
+        <w:trPr>
+          <w:cantSplit/>
+        </w:trPr>
+        <w:tc>
+          <w:tcPr>
+            <w:tcW w:type="dxa" w:w="700"/>
+            <w:tcBorders>
+              <w:top w:val="single" w:color="BFBFBF" w:sz="4"/>
+              <w:left w:val="single" w:color="BFBFBF" w:sz="4"/>
+              <w:bottom w:val="single" w:color="BFBFBF" w:sz="4"/>
+              <w:right w:val="single" w:color="BFBFBF" w:sz="4"/>
+            </w:tcBorders>
+            <w:tcMar>
+              <w:top w:type="dxa" w:w="30"/>
+              <w:left w:type="dxa" w:w="80"/>
+              <w:bottom w:type="dxa" w:w="30"/>
+              <w:right w:type="dxa" w:w="80"/>
+            </w:tcMar>
+            <w:vAlign w:val="top"/>
+          </w:tcPr>
+          <w:p>
+            <w:pPr>
+              <w:keepNext/>
+              <w:spacing w:after="0" w:before="0" w:line="240" w:lineRule="auto"/>
+            </w:pPr>
+            <w:r>
+              <w:rPr>
+                <w:b/>
+                <w:bCs/>
+                <w:sz w:val="16"/>
+                <w:szCs w:val="16"/>
+              </w:rPr>
+              <w:t xml:space="preserve">EP</w:t>
+            </w:r>
+          </w:p>
+        </w:tc>
+        <w:tc>
+          <w:tcPr>
+            <w:tcW w:type="dxa" w:w="2065"/>
+            <w:tcBorders>
+              <w:top w:val="single" w:color="BFBFBF" w:sz="4"/>
+              <w:left w:val="single" w:color="BFBFBF" w:sz="4"/>
+              <w:bottom w:val="single" w:color="BFBFBF" w:sz="4"/>
+              <w:right w:val="single" w:color="BFBFBF" w:sz="4"/>
+            </w:tcBorders>
+            <w:tcMar>
+              <w:top w:type="dxa" w:w="30"/>
+              <w:left w:type="dxa" w:w="80"/>
+              <w:bottom w:type="dxa" w:w="30"/>
+              <w:right w:type="dxa" w:w="80"/>
+            </w:tcMar>
+            <w:vAlign w:val="top"/>
+          </w:tcPr>
+          <w:p>
+            <w:pPr>
+              <w:keepNext/>
+              <w:spacing w:after="0" w:before="0" w:line="240" w:lineRule="auto"/>
+            </w:pPr>
+            <w:r>
+              <w:rPr>
+                <w:sz w:val="16"/>
+                <w:szCs w:val="16"/>
+              </w:rPr>
+              <w:t xml:space="preserve">Epoksi toz kaplama</w:t>
+            </w:r>
+          </w:p>
+        </w:tc>
+        <w:tc>
+          <w:tcPr>
+            <w:tcW w:type="dxa" w:w="1697"/>
+            <w:tcBorders>
+              <w:top w:val="single" w:color="BFBFBF" w:sz="4"/>
+              <w:left w:val="single" w:color="BFBFBF" w:sz="4"/>
+              <w:bottom w:val="single" w:color="BFBFBF" w:sz="4"/>
+              <w:right w:val="single" w:color="BFBFBF" w:sz="4"/>
+            </w:tcBorders>
+            <w:tcMar>
+              <w:top w:type="dxa" w:w="30"/>
+              <w:left w:type="dxa" w:w="80"/>
+              <w:bottom w:type="dxa" w:w="30"/>
+              <w:right w:type="dxa" w:w="80"/>
+            </w:tcMar>
+            <w:vAlign w:val="top"/>
+          </w:tcPr>
+          <w:p>
+            <w:pPr>
+              <w:keepNext/>
+              <w:spacing w:after="0" w:before="0" w:line="240" w:lineRule="auto"/>
+            </w:pPr>
+            <w:r>
+              <w:rPr>
+                <w:sz w:val="16"/>
+                <w:szCs w:val="16"/>
+              </w:rPr>
+              <w:t xml:space="preserve">Talep: hizmet alımı</w:t>
+            </w:r>
+          </w:p>
+        </w:tc>
+        <w:tc>
+          <w:tcPr>
+            <w:tcW w:type="dxa" w:w="1417"/>
+            <w:tcBorders>
+              <w:top w:val="single" w:color="BFBFBF" w:sz="4"/>
+              <w:left w:val="single" w:color="BFBFBF" w:sz="4"/>
+              <w:bottom w:val="single" w:color="BFBFBF" w:sz="4"/>
+              <w:right w:val="single" w:color="BFBFBF" w:sz="4"/>
+            </w:tcBorders>
+            <w:tcMar>
+              <w:top w:type="dxa" w:w="30"/>
+              <w:left w:type="dxa" w:w="80"/>
+              <w:bottom w:type="dxa" w:w="30"/>
+              <w:right w:type="dxa" w:w="80"/>
+            </w:tcMar>
+            <w:vAlign w:val="top"/>
+          </w:tcPr>
+          <w:p>
+            <w:pPr>
+              <w:keepNext/>
+              <w:spacing w:after="0" w:before="0" w:line="240" w:lineRule="auto"/>
+            </w:pPr>
+            <w:r>
+              <w:rPr>
+                <w:sz w:val="16"/>
+                <w:szCs w:val="16"/>
+              </w:rPr>
+              <w:t xml:space="preserve">4,35 × 2,10</w:t>
+            </w:r>
+          </w:p>
+        </w:tc>
+        <w:tc>
+          <w:tcPr>
+            <w:tcW w:type="dxa" w:w="3759"/>
+            <w:tcBorders>
+              <w:top w:val="single" w:color="BFBFBF" w:sz="4"/>
+              <w:left w:val="single" w:color="BFBFBF" w:sz="4"/>
+              <w:bottom w:val="single" w:color="BFBFBF" w:sz="4"/>
+              <w:right w:val="single" w:color="BFBFBF" w:sz="4"/>
+            </w:tcBorders>
+            <w:tcMar>
+              <w:top w:type="dxa" w:w="30"/>
+              <w:left w:type="dxa" w:w="80"/>
+              <w:bottom w:type="dxa" w:w="30"/>
+              <w:right w:type="dxa" w:w="80"/>
+            </w:tcMar>
+            <w:vAlign w:val="top"/>
+          </w:tcPr>
+          <w:p>
+            <w:pPr>
+              <w:keepNext/>
+              <w:spacing w:after="0" w:before="0" w:line="240" w:lineRule="auto"/>
+            </w:pPr>
+            <w:r>
+              <w:rPr>
+                <w:sz w:val="16"/>
+                <w:szCs w:val="16"/>
+              </w:rPr>
+              <w:t xml:space="preserve">Düz bakır parçalara; kalınlık belirtilir</w:t>
+            </w:r>
+          </w:p>
+        </w:tc>
+      </w:tr>
+      <w:tr>
+        <w:trPr>
+          <w:cantSplit/>
+        </w:trPr>
+        <w:tc>
+          <w:tcPr>
+            <w:tcW w:type="dxa" w:w="700"/>
+            <w:tcBorders>
+              <w:top w:val="single" w:color="BFBFBF" w:sz="4"/>
+              <w:left w:val="single" w:color="BFBFBF" w:sz="4"/>
+              <w:bottom w:val="single" w:color="BFBFBF" w:sz="4"/>
+              <w:right w:val="single" w:color="BFBFBF" w:sz="4"/>
+            </w:tcBorders>
+            <w:shd w:fill="F5F7FB" w:color="auto" w:val="clear"/>
+            <w:tcMar>
+              <w:top w:type="dxa" w:w="30"/>
+              <w:left w:type="dxa" w:w="80"/>
+              <w:bottom w:type="dxa" w:w="30"/>
+              <w:right w:type="dxa" w:w="80"/>
+            </w:tcMar>
+            <w:vAlign w:val="top"/>
+          </w:tcPr>
+          <w:p>
+            <w:pPr>
               <w:keepNext w:val="false"/>
               <w:spacing w:after="0" w:before="0" w:line="240" w:lineRule="auto"/>
             </w:pPr>
             <w:r>
               <w:rPr>
-                <w:sz w:val="16"/>
-                <w:szCs w:val="16"/>
-              </w:rPr>
-              <w:t xml:space="preserve">Ekstrüde PEEK, PEEK tüp, PEEK makaron, epoksi toz, parylene</w:t>
-            </w:r>
-          </w:p>
-        </w:tc>
-        <w:tc>
-          <w:tcPr>
-            <w:tcW w:type="dxa" w:w="1929"/>
+                <w:b/>
+                <w:bCs/>
+                <w:sz w:val="16"/>
+                <w:szCs w:val="16"/>
+              </w:rPr>
+              <w:t xml:space="preserve">PA</w:t>
+            </w:r>
+          </w:p>
+        </w:tc>
+        <w:tc>
+          <w:tcPr>
+            <w:tcW w:type="dxa" w:w="2065"/>
             <w:tcBorders>
               <w:top w:val="single" w:color="BFBFBF" w:sz="4"/>
               <w:left w:val="single" w:color="BFBFBF" w:sz="4"/>
@@ -1030,13 +1848,13 @@
                 <w:sz w:val="16"/>
                 <w:szCs w:val="16"/>
               </w:rPr>
-              <w:t xml:space="preserve">4,35 × 2,10</w:t>
-            </w:r>
-          </w:p>
-        </w:tc>
-        <w:tc>
-          <w:tcPr>
-            <w:tcW w:type="dxa" w:w="2447"/>
+              <w:t xml:space="preserve">Parylene HT, emaye üstü</w:t>
+            </w:r>
+          </w:p>
+        </w:tc>
+        <w:tc>
+          <w:tcPr>
+            <w:tcW w:type="dxa" w:w="1697"/>
             <w:tcBorders>
               <w:top w:val="single" w:color="BFBFBF" w:sz="4"/>
               <w:left w:val="single" w:color="BFBFBF" w:sz="4"/>
@@ -1062,7 +1880,71 @@
                 <w:sz w:val="16"/>
                 <w:szCs w:val="16"/>
               </w:rPr>
-              <w:t xml:space="preserve">Malzeme hazır olunca aynı planla</w:t>
+              <w:t xml:space="preserve">Talep: hizmet alımı</w:t>
+            </w:r>
+          </w:p>
+        </w:tc>
+        <w:tc>
+          <w:tcPr>
+            <w:tcW w:type="dxa" w:w="1417"/>
+            <w:tcBorders>
+              <w:top w:val="single" w:color="BFBFBF" w:sz="4"/>
+              <w:left w:val="single" w:color="BFBFBF" w:sz="4"/>
+              <w:bottom w:val="single" w:color="BFBFBF" w:sz="4"/>
+              <w:right w:val="single" w:color="BFBFBF" w:sz="4"/>
+            </w:tcBorders>
+            <w:shd w:fill="F5F7FB" w:color="auto" w:val="clear"/>
+            <w:tcMar>
+              <w:top w:type="dxa" w:w="30"/>
+              <w:left w:type="dxa" w:w="80"/>
+              <w:bottom w:type="dxa" w:w="30"/>
+              <w:right w:type="dxa" w:w="80"/>
+            </w:tcMar>
+            <w:vAlign w:val="top"/>
+          </w:tcPr>
+          <w:p>
+            <w:pPr>
+              <w:keepNext w:val="false"/>
+              <w:spacing w:after="0" w:before="0" w:line="240" w:lineRule="auto"/>
+            </w:pPr>
+            <w:r>
+              <w:rPr>
+                <w:sz w:val="16"/>
+                <w:szCs w:val="16"/>
+              </w:rPr>
+              <w:t xml:space="preserve">5,60 × 2,25</w:t>
+            </w:r>
+          </w:p>
+        </w:tc>
+        <w:tc>
+          <w:tcPr>
+            <w:tcW w:type="dxa" w:w="3759"/>
+            <w:tcBorders>
+              <w:top w:val="single" w:color="BFBFBF" w:sz="4"/>
+              <w:left w:val="single" w:color="BFBFBF" w:sz="4"/>
+              <w:bottom w:val="single" w:color="BFBFBF" w:sz="4"/>
+              <w:right w:val="single" w:color="BFBFBF" w:sz="4"/>
+            </w:tcBorders>
+            <w:shd w:fill="F5F7FB" w:color="auto" w:val="clear"/>
+            <w:tcMar>
+              <w:top w:type="dxa" w:w="30"/>
+              <w:left w:type="dxa" w:w="80"/>
+              <w:bottom w:type="dxa" w:w="30"/>
+              <w:right w:type="dxa" w:w="80"/>
+            </w:tcMar>
+            <w:vAlign w:val="top"/>
+          </w:tcPr>
+          <w:p>
+            <w:pPr>
+              <w:keepNext w:val="false"/>
+              <w:spacing w:after="0" w:before="0" w:line="240" w:lineRule="auto"/>
+            </w:pPr>
+            <w:r>
+              <w:rPr>
+                <w:sz w:val="16"/>
+                <w:szCs w:val="16"/>
+              </w:rPr>
+              <w:t xml:space="preserve">E teli üzerine, ≤40 µm; E ile karşılaştırılır</w:t>
             </w:r>
           </w:p>
         </w:tc>
@@ -1072,6 +1954,18 @@
       <w:pPr>
         <w:spacing w:after="120" w:before="0"/>
       </w:pPr>
+    </w:p>
+    <w:p>
+      <w:pPr>
+        <w:keepNext w:val="false"/>
+      </w:pPr>
+      <w:r>
+        <w:rPr>
+          <w:sz w:val="20"/>
+          <w:szCs w:val="20"/>
+        </w:rPr>
+        <w:t xml:space="preserve">A grubu (K, KC, C, E, FC) stokta vardır. B grubu (PX, PT, PS, EP, PA) talep edilecektir; her biri için en az 20 m gerekir (Bölüm 6). B grubu malzemeleri geldiğinde aynı planla test edilir.</w:t>
+      </w:r>
     </w:p>
     <w:p>
       <w:pPr>
@@ -1134,7 +2028,7 @@
           <w:sz w:val="20"/>
           <w:szCs w:val="20"/>
         </w:rPr>
-        <w:t xml:space="preserve"> iki düz numune 150 mm kaydırılarak geniş yüzleri üst üste gelecek şekilde konur; temas boyu 150 mm'dir ve soyulmuş uçlar dışa bakar. Çift yalnız ölçüm sırasında PTFE bant veya kelepçeyle birleştirilir; yaşlandırmada numuneler ayrıdır. Sonda aynı iki numune aynı konumda yeniden birleştirilir. Yalıtım direnci ve PDIV için.</w:t>
+        <w:t xml:space="preserve"> iki düz numune 150 mm kaydırılarak geniş yüzleri üst üste gelecek şekilde konur; temas boyu 150 mm'dir ve soyulmuş uçlar dışa bakar. Çift yalnız ölçüm sırasında PTFE bant veya kelepçeyle birleştirilir; yaşlandırmada numuneler ayrıdır. Her ölçümde aynı iki numune aynı konumda birleştirilir. Yalıtım direnci ve PDIV için.</w:t>
       </w:r>
     </w:p>
     <w:p>
@@ -1186,7 +2080,7 @@
           <w:sz w:val="20"/>
           <w:szCs w:val="20"/>
         </w:rPr>
-        <w:t xml:space="preserve"> 6 × 25 mm çıplak bakır; her yağ kabında biri yağda, biri yağın üstünde. Yağın korozifliğini gösterir.</w:t>
+        <w:t xml:space="preserve"> 6 × 25 mm çıplak bakır; her yağ kabında 3 çift, her çiftte biri yağda, biri yağın üstünde. Yağın korozifliğini gösterir.</w:t>
       </w:r>
     </w:p>
     <w:p>
@@ -1218,7 +2112,7 @@
       <w:r>
         <w:drawing>
           <wp:inline distT="0" distB="0" distL="0" distR="0">
-            <wp:extent cx="6096000" cy="2343150"/>
+            <wp:extent cx="6096000" cy="2533650"/>
             <wp:effectExtent t="0" r="0" b="0" l="0"/>
             <wp:docPr id="1" name="" descr="" title=""/>
             <wp:cNvGraphicFramePr>
@@ -1243,7 +2137,7 @@
                   <pic:spPr bwMode="auto">
                     <a:xfrm>
                       <a:off x="0" y="0"/>
-                      <a:ext cx="6096000" cy="2343150"/>
+                      <a:ext cx="6096000" cy="2533650"/>
                     </a:xfrm>
                     <a:prstGeom prst="rect">
                       <a:avLst/>
@@ -1353,7 +2247,7 @@
           <w:sz w:val="20"/>
           <w:szCs w:val="20"/>
         </w:rPr>
-        <w:t xml:space="preserve">Yaşlandırma: izlenen numunelerin yarısı kapalı kapta e-yağa (YK), yarısı hava fırınına (HK) konur; ikisi de 150 °C'de 1000 h. BDV için ayrılan 5'er numune de aynı kollara girer. Taze yağın su içeriği ölçülür; YK kabına tanık şeritler konur.</w:t>
+        <w:t xml:space="preserve">Yaşlandırma: izlenen numunelerin yarısı kapalı kapta e-yağa (YK), yarısı hava fırınına (HK) konur; ikisi de 150 °C'de. BDV setleri de aynı kollara girer. Taze yağın su içeriği ölçülür; her yağ kabına 3 çift tanık şerit konur.</w:t>
       </w:r>
     </w:p>
     <w:p>
@@ -1370,7 +2264,7 @@
           <w:sz w:val="20"/>
           <w:szCs w:val="20"/>
         </w:rPr>
-        <w:t xml:space="preserve">Son ölçümler: kaplar oda sıcaklığına soğutulur; numuneler çıkarılır, yüzey yağı emici kâğıtla alınır ve numuneler 24 h kondisyonlanır. Aşama 1'deki ölçümler aynı sırayla tekrarlanır; her kolda 5 numunede BDV ölçülür. Yağın su içeriği ölçülür, tanık şeritler derecelendirilir.</w:t>
+        <w:t xml:space="preserve">Ölçüm noktaları (500, 1000 ve 2000 h): kaplar oda sıcaklığına soğutulur; izlenen numuneler çıkarılır, yüzey yağı emici kâğıtla alınır ve numuneler 24 h kondisyonlanır. Aşama 1'deki ölçümler aynı sırayla tekrarlanır ve o noktanın BDV seti ölçülür (her kolda 5). Yağ örneği alınır ve bir çift tanık şerit çıkarılır. 500 ve 1000 h'te izlenen numuneler aynı kaba veya fırına geri konur.</w:t>
       </w:r>
     </w:p>
     <w:p>
@@ -1407,7 +2301,7 @@
           <w:sz w:val="20"/>
           <w:szCs w:val="20"/>
         </w:rPr>
-        <w:t xml:space="preserve">Ölçümler her seferinde aynı sırayla yapılır: fotoğraf, kütle ve kalınlık, yalıtım direnci, PDIV. BDV ayrı numunelerde yapılır. Her kayıtta numune kodu, aşama, tarih, sıcaklık ve bağıl nem bulunur.</w:t>
+        <w:t xml:space="preserve">Ölçümler başta ve her ölçüm noktasında aynı sırayla yapılır: fotoğraf, kütle ve kalınlık, yalıtım direnci, PDIV. BDV ayrı numunelerde yapılır. Her kayıtta numune kodu, aşama, yaşlanma süresi, tarih, sıcaklık ve bağıl nem bulunur.</w:t>
       </w:r>
     </w:p>
     <w:tbl>
@@ -2604,7 +3498,7 @@
           <w:sz w:val="20"/>
           <w:szCs w:val="20"/>
         </w:rPr>
-        <w:t xml:space="preserve">Yalıtımlı kalınlık ve genişlik, numunede işaretli 5 noktada mikrometreyle (0,001 mm) ölçülür; sonda aynı noktalar ölçülür.</w:t>
+        <w:t xml:space="preserve">Yalıtımlı kalınlık ve genişlik, numunede işaretli 5 noktada mikrometreyle (0,001 mm) ölçülür; her ölçüm noktasında aynı noktalar ölçülür.</w:t>
       </w:r>
     </w:p>
     <w:p>
@@ -2849,7 +3743,7 @@
           <w:sz w:val="20"/>
           <w:szCs w:val="20"/>
         </w:rPr>
-        <w:t xml:space="preserve">Her ölçüm noktasında 5 numune ölçülür; ortalama, en düşük değer ve delinme yeri kaydedilir.</w:t>
+        <w:t xml:space="preserve">Başta 5 numune, her ölçüm noktasında ise her kolda 5 numune ölçülür; ortalama, en düşük değer ve delinme yeri kaydedilir.</w:t>
       </w:r>
     </w:p>
     <w:p>
@@ -2874,7 +3768,7 @@
           <w:sz w:val="20"/>
           <w:szCs w:val="20"/>
         </w:rPr>
-        <w:t xml:space="preserve">Yağın su içeriği Karl Fischer yöntemiyle ölçülür: taze yağda ve 1000 h sonunda YK kabından. Örnek, kap soğuyunca kuru ve kapalı bir şişeye alınır.</w:t>
+        <w:t xml:space="preserve">Yağın su içeriği Karl Fischer yöntemiyle ölçülür: taze yağda ve her ölçüm noktasında YK kaplarından. Örnek, kap soğuyunca kuru ve kapalı bir şişeye alınır.</w:t>
       </w:r>
     </w:p>
     <w:p>
@@ -2891,7 +3785,7 @@
           <w:sz w:val="20"/>
           <w:szCs w:val="20"/>
         </w:rPr>
-        <w:t xml:space="preserve">Ayrıca 100 mL yağ örneği koyu cam şişede saklanır; gerekirse sonra asitlik veya metal analizi yaptırılır.</w:t>
+        <w:t xml:space="preserve">2000 h sonunda her kaptan 100 mL yağ örneği koyu cam şişede saklanır; gerekirse sonra asitlik veya metal analizi yaptırılır.</w:t>
       </w:r>
     </w:p>
     <w:p>
@@ -2908,7 +3802,7 @@
           <w:sz w:val="20"/>
           <w:szCs w:val="20"/>
         </w:rPr>
-        <w:t xml:space="preserve">Tanık şeritler kükürtsüz bir çözücüyle (ör. izooktan) yıkanır, kurutulur ve ASTM D130 kararma ölçeğiyle karşılaştırılır. Yağdaki ve yağ üstündeki şerit ayrı derecelendirilir ve fotoğraflanır.</w:t>
+        <w:t xml:space="preserve">Her ölçüm noktasında bir çift tanık şerit çıkarılır. Şeritler kükürtsüz bir çözücüyle (ör. izooktan) yıkanır, kurutulur ve ASTM D130 kararma ölçeğiyle karşılaştırılır. Yağdaki ve yağ üstündeki şerit ayrı derecelendirilir ve fotoğraflanır.</w:t>
       </w:r>
     </w:p>
     <w:p>
@@ -2934,9 +3828,9 @@
       </w:tblPr>
       <w:tblGrid>
         <w:gridCol w:w="700"/>
-        <w:gridCol w:w="6536"/>
-        <w:gridCol w:w="1261"/>
-        <w:gridCol w:w="1141"/>
+        <w:gridCol w:w="5090"/>
+        <w:gridCol w:w="981"/>
+        <w:gridCol w:w="2867"/>
       </w:tblGrid>
       <w:tr>
         <w:trPr>
@@ -2979,7 +3873,7 @@
         </w:tc>
         <w:tc>
           <w:tcPr>
-            <w:tcW w:type="dxa" w:w="6536"/>
+            <w:tcW w:type="dxa" w:w="5090"/>
             <w:tcBorders>
               <w:top w:val="single" w:color="BFBFBF" w:sz="4"/>
               <w:left w:val="single" w:color="BFBFBF" w:sz="4"/>
@@ -3013,7 +3907,7 @@
         </w:tc>
         <w:tc>
           <w:tcPr>
-            <w:tcW w:type="dxa" w:w="1261"/>
+            <w:tcW w:type="dxa" w:w="981"/>
             <w:tcBorders>
               <w:top w:val="single" w:color="BFBFBF" w:sz="4"/>
               <w:left w:val="single" w:color="BFBFBF" w:sz="4"/>
@@ -3047,7 +3941,7 @@
         </w:tc>
         <w:tc>
           <w:tcPr>
-            <w:tcW w:type="dxa" w:w="1141"/>
+            <w:tcW w:type="dxa" w:w="2867"/>
             <w:tcBorders>
               <w:top w:val="single" w:color="BFBFBF" w:sz="4"/>
               <w:left w:val="single" w:color="BFBFBF" w:sz="4"/>
@@ -3075,7 +3969,7 @@
                 <w:sz w:val="16"/>
                 <w:szCs w:val="16"/>
               </w:rPr>
-              <w:t xml:space="preserve">Süre</w:t>
+              <w:t xml:space="preserve">Ölçüm noktaları</w:t>
             </w:r>
           </w:p>
         </w:tc>
@@ -3119,7 +4013,7 @@
         </w:tc>
         <w:tc>
           <w:tcPr>
-            <w:tcW w:type="dxa" w:w="6536"/>
+            <w:tcW w:type="dxa" w:w="5090"/>
             <w:tcBorders>
               <w:top w:val="single" w:color="BFBFBF" w:sz="4"/>
               <w:left w:val="single" w:color="BFBFBF" w:sz="4"/>
@@ -3150,7 +4044,7 @@
         </w:tc>
         <w:tc>
           <w:tcPr>
-            <w:tcW w:type="dxa" w:w="1261"/>
+            <w:tcW w:type="dxa" w:w="981"/>
             <w:tcBorders>
               <w:top w:val="single" w:color="BFBFBF" w:sz="4"/>
               <w:left w:val="single" w:color="BFBFBF" w:sz="4"/>
@@ -3181,32 +4075,32 @@
         </w:tc>
         <w:tc>
           <w:tcPr>
-            <w:tcW w:type="dxa" w:w="1141"/>
-            <w:tcBorders>
-              <w:top w:val="single" w:color="BFBFBF" w:sz="4"/>
-              <w:left w:val="single" w:color="BFBFBF" w:sz="4"/>
-              <w:bottom w:val="single" w:color="BFBFBF" w:sz="4"/>
-              <w:right w:val="single" w:color="BFBFBF" w:sz="4"/>
-            </w:tcBorders>
-            <w:tcMar>
-              <w:top w:type="dxa" w:w="30"/>
-              <w:left w:type="dxa" w:w="80"/>
-              <w:bottom w:type="dxa" w:w="30"/>
-              <w:right w:type="dxa" w:w="80"/>
-            </w:tcMar>
-            <w:vAlign w:val="top"/>
-          </w:tcPr>
-          <w:p>
-            <w:pPr>
-              <w:keepNext/>
-              <w:spacing w:after="0" w:before="0" w:line="240" w:lineRule="auto"/>
-            </w:pPr>
-            <w:r>
-              <w:rPr>
-                <w:sz w:val="16"/>
-                <w:szCs w:val="16"/>
-              </w:rPr>
-              <w:t xml:space="preserve">1000 h</w:t>
+            <w:tcW w:type="dxa" w:w="2867"/>
+            <w:tcBorders>
+              <w:top w:val="single" w:color="BFBFBF" w:sz="4"/>
+              <w:left w:val="single" w:color="BFBFBF" w:sz="4"/>
+              <w:bottom w:val="single" w:color="BFBFBF" w:sz="4"/>
+              <w:right w:val="single" w:color="BFBFBF" w:sz="4"/>
+            </w:tcBorders>
+            <w:tcMar>
+              <w:top w:type="dxa" w:w="30"/>
+              <w:left w:type="dxa" w:w="80"/>
+              <w:bottom w:type="dxa" w:w="30"/>
+              <w:right w:type="dxa" w:w="80"/>
+            </w:tcMar>
+            <w:vAlign w:val="top"/>
+          </w:tcPr>
+          <w:p>
+            <w:pPr>
+              <w:keepNext/>
+              <w:spacing w:after="0" w:before="0" w:line="240" w:lineRule="auto"/>
+            </w:pPr>
+            <w:r>
+              <w:rPr>
+                <w:sz w:val="16"/>
+                <w:szCs w:val="16"/>
+              </w:rPr>
+              <w:t xml:space="preserve">500 / 1000 / 2000 h</w:t>
             </w:r>
           </w:p>
         </w:tc>
@@ -3251,7 +4145,7 @@
         </w:tc>
         <w:tc>
           <w:tcPr>
-            <w:tcW w:type="dxa" w:w="6536"/>
+            <w:tcW w:type="dxa" w:w="5090"/>
             <w:tcBorders>
               <w:top w:val="single" w:color="BFBFBF" w:sz="4"/>
               <w:left w:val="single" w:color="BFBFBF" w:sz="4"/>
@@ -3283,7 +4177,7 @@
         </w:tc>
         <w:tc>
           <w:tcPr>
-            <w:tcW w:type="dxa" w:w="1261"/>
+            <w:tcW w:type="dxa" w:w="981"/>
             <w:tcBorders>
               <w:top w:val="single" w:color="BFBFBF" w:sz="4"/>
               <w:left w:val="single" w:color="BFBFBF" w:sz="4"/>
@@ -3315,7 +4209,7 @@
         </w:tc>
         <w:tc>
           <w:tcPr>
-            <w:tcW w:type="dxa" w:w="1141"/>
+            <w:tcW w:type="dxa" w:w="2867"/>
             <w:tcBorders>
               <w:top w:val="single" w:color="BFBFBF" w:sz="4"/>
               <w:left w:val="single" w:color="BFBFBF" w:sz="4"/>
@@ -3341,7 +4235,7 @@
                 <w:sz w:val="16"/>
                 <w:szCs w:val="16"/>
               </w:rPr>
-              <w:t xml:space="preserve">1000 h</w:t>
+              <w:t xml:space="preserve">500 / 1000 / 2000 h</w:t>
             </w:r>
           </w:p>
         </w:tc>
@@ -3366,7 +4260,7 @@
           <w:sz w:val="20"/>
           <w:szCs w:val="20"/>
         </w:rPr>
-        <w:t xml:space="preserve">1000 h, IEC 60851-4 Test 20'nin yağ dayanımı süresidir; 150 °C bu testin üst sınırıdır.</w:t>
+        <w:t xml:space="preserve">1000 h noktası IEC 60851-4 Test 20'nin yağ dayanımı süresine karşılık gelir; 500 ve 2000 h eğilimi gösterir. 150 °C bu testin üst sınırıdır.</w:t>
       </w:r>
     </w:p>
     <w:p>
@@ -3434,27 +4328,44 @@
           <w:sz w:val="20"/>
           <w:szCs w:val="20"/>
         </w:rPr>
-        <w:t xml:space="preserve">Kap açılmadan önce oda sıcaklığına soğutulur; yaşlandırma boyunca yağ değiştirilmez.</w:t>
-      </w:r>
-    </w:p>
-    <w:p>
-      <w:pPr>
-        <w:pStyle w:val="Heading1"/>
-      </w:pPr>
-      <w:r>
-        <w:t xml:space="preserve">5. Değerlendirme</w:t>
-      </w:r>
-    </w:p>
-    <w:p>
-      <w:pPr>
-        <w:keepNext w:val="false"/>
+        <w:t xml:space="preserve">Kap açılmadan önce oda sıcaklığına soğutulur. Ölçümler sürerken kaplar kapalı ve oda sıcaklığında bekler, fırın da kapatılır; yaşlanma süresi yalnız 150 °C'de geçen süredir.</w:t>
+      </w:r>
+    </w:p>
+    <w:p>
+      <w:pPr>
+        <w:pStyle w:val="ListParagraph"/>
+        <w:numPr>
+          <w:ilvl w:val="0"/>
+          <w:numId w:val="2"/>
+        </w:numPr>
+        <w:spacing w:after="60"/>
       </w:pPr>
       <w:r>
         <w:rPr>
           <w:sz w:val="20"/>
           <w:szCs w:val="20"/>
         </w:rPr>
-        <w:t xml:space="preserve">Ana ölçüt korunumdur: son değer / yağsız değer, aynı numunede. Yağın etkisi, aynı süredeki YK korunumu ile HK korunumu arasındaki farktır.</w:t>
+        <w:t xml:space="preserve">Yaşlandırma boyunca yağ değiştirilmez ve eklenmez.</w:t>
+      </w:r>
+    </w:p>
+    <w:p>
+      <w:pPr>
+        <w:pStyle w:val="Heading1"/>
+      </w:pPr>
+      <w:r>
+        <w:t xml:space="preserve">5. Değerlendirme</w:t>
+      </w:r>
+    </w:p>
+    <w:p>
+      <w:pPr>
+        <w:keepNext w:val="false"/>
+      </w:pPr>
+      <w:r>
+        <w:rPr>
+          <w:sz w:val="20"/>
+          <w:szCs w:val="20"/>
+        </w:rPr>
+        <w:t xml:space="preserve">Ana ölçüt korunumdur: ölçüm noktasındaki değer / yağsız değer, aynı numunede. Yağın etkisi, aynı süredeki YK korunumu ile HK korunumu arasındaki farktır. Korunum 500, 1000 ve 2000 h'e karşı çizilerek eğilim gösterilir.</w:t>
       </w:r>
     </w:p>
     <w:p>
@@ -4355,7 +5266,7 @@
           <w:sz w:val="20"/>
           <w:szCs w:val="20"/>
         </w:rPr>
-        <w:t xml:space="preserve">PDIV korunumu en az %50.</w:t>
+        <w:t xml:space="preserve">PDIV korunumu 2000 h'te en az %50.</w:t>
       </w:r>
     </w:p>
     <w:p>
@@ -4372,7 +5283,7 @@
           <w:sz w:val="20"/>
           <w:szCs w:val="20"/>
         </w:rPr>
-        <w:t xml:space="preserve">En düşük PDIV değeri ilgili sınıfın hedefini karşılamalı.</w:t>
+        <w:t xml:space="preserve">Ölçüm noktalarındaki en düşük PDIV, ilgili sınıfın yaşlanmış hedefini karşılamalı.</w:t>
       </w:r>
     </w:p>
     <w:p>
@@ -4426,9 +5337,9 @@
         <w:tblLayout w:type="fixed"/>
       </w:tblPr>
       <w:tblGrid>
-        <w:gridCol w:w="1775"/>
+        <w:gridCol w:w="1633"/>
         <w:gridCol w:w="752"/>
-        <w:gridCol w:w="7111"/>
+        <w:gridCol w:w="7253"/>
       </w:tblGrid>
       <w:tr>
         <w:trPr>
@@ -4437,7 +5348,7 @@
         </w:trPr>
         <w:tc>
           <w:tcPr>
-            <w:tcW w:type="dxa" w:w="1775"/>
+            <w:tcW w:type="dxa" w:w="1633"/>
             <w:tcBorders>
               <w:top w:val="single" w:color="BFBFBF" w:sz="4"/>
               <w:left w:val="single" w:color="BFBFBF" w:sz="4"/>
@@ -4505,7 +5416,7 @@
         </w:tc>
         <w:tc>
           <w:tcPr>
-            <w:tcW w:type="dxa" w:w="7111"/>
+            <w:tcW w:type="dxa" w:w="7253"/>
             <w:tcBorders>
               <w:top w:val="single" w:color="BFBFBF" w:sz="4"/>
               <w:left w:val="single" w:color="BFBFBF" w:sz="4"/>
@@ -4544,7 +5455,7 @@
         </w:trPr>
         <w:tc>
           <w:tcPr>
-            <w:tcW w:type="dxa" w:w="1775"/>
+            <w:tcW w:type="dxa" w:w="1633"/>
             <w:tcBorders>
               <w:top w:val="single" w:color="BFBFBF" w:sz="4"/>
               <w:left w:val="single" w:color="BFBFBF" w:sz="4"/>
@@ -4608,7 +5519,7 @@
         </w:tc>
         <w:tc>
           <w:tcPr>
-            <w:tcW w:type="dxa" w:w="7111"/>
+            <w:tcW w:type="dxa" w:w="7253"/>
             <w:tcBorders>
               <w:top w:val="single" w:color="BFBFBF" w:sz="4"/>
               <w:left w:val="single" w:color="BFBFBF" w:sz="4"/>
@@ -4644,7 +5555,7 @@
         </w:trPr>
         <w:tc>
           <w:tcPr>
-            <w:tcW w:type="dxa" w:w="1775"/>
+            <w:tcW w:type="dxa" w:w="1633"/>
             <w:tcBorders>
               <w:top w:val="single" w:color="BFBFBF" w:sz="4"/>
               <w:left w:val="single" w:color="BFBFBF" w:sz="4"/>
@@ -4704,13 +5615,13 @@
                 <w:sz w:val="16"/>
                 <w:szCs w:val="16"/>
               </w:rPr>
-              <w:t xml:space="preserve">15</w:t>
-            </w:r>
-          </w:p>
-        </w:tc>
-        <w:tc>
-          <w:tcPr>
-            <w:tcW w:type="dxa" w:w="7111"/>
+              <w:t xml:space="preserve">35</w:t>
+            </w:r>
+          </w:p>
+        </w:tc>
+        <w:tc>
+          <w:tcPr>
+            <w:tcW w:type="dxa" w:w="7253"/>
             <w:tcBorders>
               <w:top w:val="single" w:color="BFBFBF" w:sz="4"/>
               <w:left w:val="single" w:color="BFBFBF" w:sz="4"/>
@@ -4736,7 +5647,7 @@
                 <w:sz w:val="16"/>
                 <w:szCs w:val="16"/>
               </w:rPr>
-              <w:t xml:space="preserve">Başta 5; sonda YK'da 5, HK'da 5</w:t>
+              <w:t xml:space="preserve">Başta 5; her kolda 500, 1000 ve 2000 h'te 5'er</w:t>
             </w:r>
           </w:p>
         </w:tc>
@@ -4747,7 +5658,7 @@
         </w:trPr>
         <w:tc>
           <w:tcPr>
-            <w:tcW w:type="dxa" w:w="1775"/>
+            <w:tcW w:type="dxa" w:w="1633"/>
             <w:tcBorders>
               <w:top w:val="single" w:color="BFBFBF" w:sz="4"/>
               <w:left w:val="single" w:color="BFBFBF" w:sz="4"/>
@@ -4805,13 +5716,13 @@
                 <w:sz w:val="16"/>
                 <w:szCs w:val="16"/>
               </w:rPr>
-              <w:t xml:space="preserve">41</w:t>
-            </w:r>
-          </w:p>
-        </w:tc>
-        <w:tc>
-          <w:tcPr>
-            <w:tcW w:type="dxa" w:w="7111"/>
+              <w:t xml:space="preserve">61</w:t>
+            </w:r>
+          </w:p>
+        </w:tc>
+        <w:tc>
+          <w:tcPr>
+            <w:tcW w:type="dxa" w:w="7253"/>
             <w:tcBorders>
               <w:top w:val="single" w:color="BFBFBF" w:sz="4"/>
               <w:left w:val="single" w:color="BFBFBF" w:sz="4"/>
@@ -4836,7 +5747,7 @@
                 <w:sz w:val="16"/>
                 <w:szCs w:val="16"/>
               </w:rPr>
-              <w:t xml:space="preserve">≈12 m; 4,35 × 2,10 kesitte ≈1 kg</w:t>
+              <w:t xml:space="preserve">≈18 m; 4,35 × 2,10 kesitte ≈1,5 kg</w:t>
             </w:r>
           </w:p>
         </w:tc>
@@ -4856,7 +5767,19 @@
           <w:sz w:val="20"/>
           <w:szCs w:val="20"/>
         </w:rPr>
-        <w:t xml:space="preserve">Dört stok ailesi (K, KC, C, E) için toplam yaklaşık 165 numune gerekir. Aşama 1 yaklaşık 2 hafta, Aşama 2 ise 1000 h (yaklaşık 6 hafta) ve 1 haftalık son ölçümler sürer. Toplam süre yaklaşık 9–10 haftadır.</w:t>
+        <w:t xml:space="preserve">A grubunun dört ailesi (K, KC, C, E) için yaklaşık 245 numune gerekir; FC eklenirse 61 numune daha. B grubundaki her malzeme için en az 20 m talep edilmelidir (61 numune ≈ 18 m, artı yedek).</w:t>
+      </w:r>
+    </w:p>
+    <w:p>
+      <w:pPr>
+        <w:keepNext w:val="false"/>
+      </w:pPr>
+      <w:r>
+        <w:rPr>
+          <w:sz w:val="20"/>
+          <w:szCs w:val="20"/>
+        </w:rPr>
+        <w:t xml:space="preserve">Aşama 1 yaklaşık 2 hafta sürer. Aşama 2'de 2000 h yaşlandırma yaklaşık 12 hafta sürer; üç ölçüm noktası yaklaşık 3 hafta ekler. Toplam süre yaklaşık 17 haftadır (≈4 ay). B grubu, malzemeler geldiğinde aynı takvimle yürür.</w:t>
       </w:r>
     </w:p>
     <w:p>
@@ -4893,9 +5816,9 @@
         <w:tblLayout w:type="fixed"/>
       </w:tblPr>
       <w:tblGrid>
-        <w:gridCol w:w="2757"/>
-        <w:gridCol w:w="4212"/>
-        <w:gridCol w:w="2669"/>
+        <w:gridCol w:w="2701"/>
+        <w:gridCol w:w="4288"/>
+        <w:gridCol w:w="2649"/>
       </w:tblGrid>
       <w:tr>
         <w:trPr>
@@ -4904,7 +5827,7 @@
         </w:trPr>
         <w:tc>
           <w:tcPr>
-            <w:tcW w:type="dxa" w:w="2757"/>
+            <w:tcW w:type="dxa" w:w="2701"/>
             <w:tcBorders>
               <w:top w:val="single" w:color="BFBFBF" w:sz="4"/>
               <w:left w:val="single" w:color="BFBFBF" w:sz="4"/>
@@ -4938,7 +5861,7 @@
         </w:tc>
         <w:tc>
           <w:tcPr>
-            <w:tcW w:type="dxa" w:w="4212"/>
+            <w:tcW w:type="dxa" w:w="4288"/>
             <w:tcBorders>
               <w:top w:val="single" w:color="BFBFBF" w:sz="4"/>
               <w:left w:val="single" w:color="BFBFBF" w:sz="4"/>
@@ -4972,7 +5895,7 @@
         </w:tc>
         <w:tc>
           <w:tcPr>
-            <w:tcW w:type="dxa" w:w="2669"/>
+            <w:tcW w:type="dxa" w:w="2649"/>
             <w:tcBorders>
               <w:top w:val="single" w:color="BFBFBF" w:sz="4"/>
               <w:left w:val="single" w:color="BFBFBF" w:sz="4"/>
@@ -5011,7 +5934,7 @@
         </w:trPr>
         <w:tc>
           <w:tcPr>
-            <w:tcW w:type="dxa" w:w="2757"/>
+            <w:tcW w:type="dxa" w:w="2701"/>
             <w:tcBorders>
               <w:top w:val="single" w:color="BFBFBF" w:sz="4"/>
               <w:left w:val="single" w:color="BFBFBF" w:sz="4"/>
@@ -5044,7 +5967,7 @@
         </w:tc>
         <w:tc>
           <w:tcPr>
-            <w:tcW w:type="dxa" w:w="4212"/>
+            <w:tcW w:type="dxa" w:w="4288"/>
             <w:tcBorders>
               <w:top w:val="single" w:color="BFBFBF" w:sz="4"/>
               <w:left w:val="single" w:color="BFBFBF" w:sz="4"/>
@@ -5075,7 +5998,7 @@
         </w:tc>
         <w:tc>
           <w:tcPr>
-            <w:tcW w:type="dxa" w:w="2669"/>
+            <w:tcW w:type="dxa" w:w="2649"/>
             <w:tcBorders>
               <w:top w:val="single" w:color="BFBFBF" w:sz="4"/>
               <w:left w:val="single" w:color="BFBFBF" w:sz="4"/>
@@ -5111,7 +6034,7 @@
         </w:trPr>
         <w:tc>
           <w:tcPr>
-            <w:tcW w:type="dxa" w:w="2757"/>
+            <w:tcW w:type="dxa" w:w="2701"/>
             <w:tcBorders>
               <w:top w:val="single" w:color="BFBFBF" w:sz="4"/>
               <w:left w:val="single" w:color="BFBFBF" w:sz="4"/>
@@ -5145,7 +6068,7 @@
         </w:tc>
         <w:tc>
           <w:tcPr>
-            <w:tcW w:type="dxa" w:w="4212"/>
+            <w:tcW w:type="dxa" w:w="4288"/>
             <w:tcBorders>
               <w:top w:val="single" w:color="BFBFBF" w:sz="4"/>
               <w:left w:val="single" w:color="BFBFBF" w:sz="4"/>
@@ -5177,7 +6100,7 @@
         </w:tc>
         <w:tc>
           <w:tcPr>
-            <w:tcW w:type="dxa" w:w="2669"/>
+            <w:tcW w:type="dxa" w:w="2649"/>
             <w:tcBorders>
               <w:top w:val="single" w:color="BFBFBF" w:sz="4"/>
               <w:left w:val="single" w:color="BFBFBF" w:sz="4"/>
@@ -5214,7 +6137,7 @@
         </w:trPr>
         <w:tc>
           <w:tcPr>
-            <w:tcW w:type="dxa" w:w="2757"/>
+            <w:tcW w:type="dxa" w:w="2701"/>
             <w:tcBorders>
               <w:top w:val="single" w:color="BFBFBF" w:sz="4"/>
               <w:left w:val="single" w:color="BFBFBF" w:sz="4"/>
@@ -5247,7 +6170,7 @@
         </w:tc>
         <w:tc>
           <w:tcPr>
-            <w:tcW w:type="dxa" w:w="4212"/>
+            <w:tcW w:type="dxa" w:w="4288"/>
             <w:tcBorders>
               <w:top w:val="single" w:color="BFBFBF" w:sz="4"/>
               <w:left w:val="single" w:color="BFBFBF" w:sz="4"/>
@@ -5278,7 +6201,7 @@
         </w:tc>
         <w:tc>
           <w:tcPr>
-            <w:tcW w:type="dxa" w:w="2669"/>
+            <w:tcW w:type="dxa" w:w="2649"/>
             <w:tcBorders>
               <w:top w:val="single" w:color="BFBFBF" w:sz="4"/>
               <w:left w:val="single" w:color="BFBFBF" w:sz="4"/>
@@ -5314,7 +6237,7 @@
         </w:trPr>
         <w:tc>
           <w:tcPr>
-            <w:tcW w:type="dxa" w:w="2757"/>
+            <w:tcW w:type="dxa" w:w="2701"/>
             <w:tcBorders>
               <w:top w:val="single" w:color="BFBFBF" w:sz="4"/>
               <w:left w:val="single" w:color="BFBFBF" w:sz="4"/>
@@ -5348,7 +6271,7 @@
         </w:tc>
         <w:tc>
           <w:tcPr>
-            <w:tcW w:type="dxa" w:w="4212"/>
+            <w:tcW w:type="dxa" w:w="4288"/>
             <w:tcBorders>
               <w:top w:val="single" w:color="BFBFBF" w:sz="4"/>
               <w:left w:val="single" w:color="BFBFBF" w:sz="4"/>
@@ -5380,7 +6303,7 @@
         </w:tc>
         <w:tc>
           <w:tcPr>
-            <w:tcW w:type="dxa" w:w="2669"/>
+            <w:tcW w:type="dxa" w:w="2649"/>
             <w:tcBorders>
               <w:top w:val="single" w:color="BFBFBF" w:sz="4"/>
               <w:left w:val="single" w:color="BFBFBF" w:sz="4"/>
@@ -5417,7 +6340,7 @@
         </w:trPr>
         <w:tc>
           <w:tcPr>
-            <w:tcW w:type="dxa" w:w="2757"/>
+            <w:tcW w:type="dxa" w:w="2701"/>
             <w:tcBorders>
               <w:top w:val="single" w:color="BFBFBF" w:sz="4"/>
               <w:left w:val="single" w:color="BFBFBF" w:sz="4"/>
@@ -5450,7 +6373,7 @@
         </w:tc>
         <w:tc>
           <w:tcPr>
-            <w:tcW w:type="dxa" w:w="4212"/>
+            <w:tcW w:type="dxa" w:w="4288"/>
             <w:tcBorders>
               <w:top w:val="single" w:color="BFBFBF" w:sz="4"/>
               <w:left w:val="single" w:color="BFBFBF" w:sz="4"/>
@@ -5481,7 +6404,7 @@
         </w:tc>
         <w:tc>
           <w:tcPr>
-            <w:tcW w:type="dxa" w:w="2669"/>
+            <w:tcW w:type="dxa" w:w="2649"/>
             <w:tcBorders>
               <w:top w:val="single" w:color="BFBFBF" w:sz="4"/>
               <w:left w:val="single" w:color="BFBFBF" w:sz="4"/>
@@ -5517,7 +6440,7 @@
         </w:trPr>
         <w:tc>
           <w:tcPr>
-            <w:tcW w:type="dxa" w:w="2757"/>
+            <w:tcW w:type="dxa" w:w="2701"/>
             <w:tcBorders>
               <w:top w:val="single" w:color="BFBFBF" w:sz="4"/>
               <w:left w:val="single" w:color="BFBFBF" w:sz="4"/>
@@ -5545,13 +6468,13 @@
                 <w:sz w:val="16"/>
                 <w:szCs w:val="16"/>
               </w:rPr>
-              <w:t xml:space="preserve">Ara ölçüm (500 h) ve 2000 h</w:t>
-            </w:r>
-          </w:p>
-        </w:tc>
-        <w:tc>
-          <w:tcPr>
-            <w:tcW w:type="dxa" w:w="4212"/>
+              <w:t xml:space="preserve">Kurutma sonrası tekrar ölçüm</w:t>
+            </w:r>
+          </w:p>
+        </w:tc>
+        <w:tc>
+          <w:tcPr>
+            <w:tcW w:type="dxa" w:w="4288"/>
             <w:tcBorders>
               <w:top w:val="single" w:color="BFBFBF" w:sz="4"/>
               <w:left w:val="single" w:color="BFBFBF" w:sz="4"/>
@@ -5577,13 +6500,13 @@
                 <w:sz w:val="16"/>
                 <w:szCs w:val="16"/>
               </w:rPr>
-              <w:t xml:space="preserve">Süreyi uzatır</w:t>
-            </w:r>
-          </w:p>
-        </w:tc>
-        <w:tc>
-          <w:tcPr>
-            <w:tcW w:type="dxa" w:w="2669"/>
+              <w:t xml:space="preserve">Ek ölçüm turu ister</w:t>
+            </w:r>
+          </w:p>
+        </w:tc>
+        <w:tc>
+          <w:tcPr>
+            <w:tcW w:type="dxa" w:w="2649"/>
             <w:tcBorders>
               <w:top w:val="single" w:color="BFBFBF" w:sz="4"/>
               <w:left w:val="single" w:color="BFBFBF" w:sz="4"/>
@@ -5609,7 +6532,7 @@
                 <w:sz w:val="16"/>
                 <w:szCs w:val="16"/>
               </w:rPr>
-              <w:t xml:space="preserve">1000 h sonrası devam</w:t>
+              <w:t xml:space="preserve">Emilimin geri dönüp dönmediğini görmek için</w:t>
             </w:r>
           </w:p>
         </w:tc>
@@ -5620,7 +6543,7 @@
         </w:trPr>
         <w:tc>
           <w:tcPr>
-            <w:tcW w:type="dxa" w:w="2757"/>
+            <w:tcW w:type="dxa" w:w="2701"/>
             <w:tcBorders>
               <w:top w:val="single" w:color="BFBFBF" w:sz="4"/>
               <w:left w:val="single" w:color="BFBFBF" w:sz="4"/>
@@ -5647,69 +6570,69 @@
                 <w:sz w:val="16"/>
                 <w:szCs w:val="16"/>
               </w:rPr>
-              <w:t xml:space="preserve">Kurutma sonrası tekrar ölçüm</w:t>
-            </w:r>
-          </w:p>
-        </w:tc>
-        <w:tc>
-          <w:tcPr>
-            <w:tcW w:type="dxa" w:w="4212"/>
-            <w:tcBorders>
-              <w:top w:val="single" w:color="BFBFBF" w:sz="4"/>
-              <w:left w:val="single" w:color="BFBFBF" w:sz="4"/>
-              <w:bottom w:val="single" w:color="BFBFBF" w:sz="4"/>
-              <w:right w:val="single" w:color="BFBFBF" w:sz="4"/>
-            </w:tcBorders>
-            <w:tcMar>
-              <w:top w:type="dxa" w:w="30"/>
-              <w:left w:type="dxa" w:w="80"/>
-              <w:bottom w:type="dxa" w:w="30"/>
-              <w:right w:type="dxa" w:w="80"/>
-            </w:tcMar>
-            <w:vAlign w:val="top"/>
-          </w:tcPr>
-          <w:p>
-            <w:pPr>
-              <w:keepNext/>
-              <w:spacing w:after="0" w:before="0" w:line="240" w:lineRule="auto"/>
-            </w:pPr>
-            <w:r>
-              <w:rPr>
-                <w:sz w:val="16"/>
-                <w:szCs w:val="16"/>
-              </w:rPr>
-              <w:t xml:space="preserve">Ek ölçüm turu ister</w:t>
-            </w:r>
-          </w:p>
-        </w:tc>
-        <w:tc>
-          <w:tcPr>
-            <w:tcW w:type="dxa" w:w="2669"/>
-            <w:tcBorders>
-              <w:top w:val="single" w:color="BFBFBF" w:sz="4"/>
-              <w:left w:val="single" w:color="BFBFBF" w:sz="4"/>
-              <w:bottom w:val="single" w:color="BFBFBF" w:sz="4"/>
-              <w:right w:val="single" w:color="BFBFBF" w:sz="4"/>
-            </w:tcBorders>
-            <w:tcMar>
-              <w:top w:type="dxa" w:w="30"/>
-              <w:left w:type="dxa" w:w="80"/>
-              <w:bottom w:type="dxa" w:w="30"/>
-              <w:right w:type="dxa" w:w="80"/>
-            </w:tcMar>
-            <w:vAlign w:val="top"/>
-          </w:tcPr>
-          <w:p>
-            <w:pPr>
-              <w:keepNext/>
-              <w:spacing w:after="0" w:before="0" w:line="240" w:lineRule="auto"/>
-            </w:pPr>
-            <w:r>
-              <w:rPr>
-                <w:sz w:val="16"/>
-                <w:szCs w:val="16"/>
-              </w:rPr>
-              <w:t xml:space="preserve">Emilimin geri dönüp dönmediğini görmek için</w:t>
+              <w:t xml:space="preserve">Yağ asitliği, özdirenç, metal analizi</w:t>
+            </w:r>
+          </w:p>
+        </w:tc>
+        <w:tc>
+          <w:tcPr>
+            <w:tcW w:type="dxa" w:w="4288"/>
+            <w:tcBorders>
+              <w:top w:val="single" w:color="BFBFBF" w:sz="4"/>
+              <w:left w:val="single" w:color="BFBFBF" w:sz="4"/>
+              <w:bottom w:val="single" w:color="BFBFBF" w:sz="4"/>
+              <w:right w:val="single" w:color="BFBFBF" w:sz="4"/>
+            </w:tcBorders>
+            <w:tcMar>
+              <w:top w:type="dxa" w:w="30"/>
+              <w:left w:type="dxa" w:w="80"/>
+              <w:bottom w:type="dxa" w:w="30"/>
+              <w:right w:type="dxa" w:w="80"/>
+            </w:tcMar>
+            <w:vAlign w:val="top"/>
+          </w:tcPr>
+          <w:p>
+            <w:pPr>
+              <w:keepNext/>
+              <w:spacing w:after="0" w:before="0" w:line="240" w:lineRule="auto"/>
+            </w:pPr>
+            <w:r>
+              <w:rPr>
+                <w:sz w:val="16"/>
+                <w:szCs w:val="16"/>
+              </w:rPr>
+              <w:t xml:space="preserve">Dış laboratuvar ister</w:t>
+            </w:r>
+          </w:p>
+        </w:tc>
+        <w:tc>
+          <w:tcPr>
+            <w:tcW w:type="dxa" w:w="2649"/>
+            <w:tcBorders>
+              <w:top w:val="single" w:color="BFBFBF" w:sz="4"/>
+              <w:left w:val="single" w:color="BFBFBF" w:sz="4"/>
+              <w:bottom w:val="single" w:color="BFBFBF" w:sz="4"/>
+              <w:right w:val="single" w:color="BFBFBF" w:sz="4"/>
+            </w:tcBorders>
+            <w:tcMar>
+              <w:top w:type="dxa" w:w="30"/>
+              <w:left w:type="dxa" w:w="80"/>
+              <w:bottom w:type="dxa" w:w="30"/>
+              <w:right w:type="dxa" w:w="80"/>
+            </w:tcMar>
+            <w:vAlign w:val="top"/>
+          </w:tcPr>
+          <w:p>
+            <w:pPr>
+              <w:keepNext/>
+              <w:spacing w:after="0" w:before="0" w:line="240" w:lineRule="auto"/>
+            </w:pPr>
+            <w:r>
+              <w:rPr>
+                <w:sz w:val="16"/>
+                <w:szCs w:val="16"/>
+              </w:rPr>
+              <w:t xml:space="preserve">Saklanan yağ örneğiyle</w:t>
             </w:r>
           </w:p>
         </w:tc>
@@ -5720,7 +6643,7 @@
         </w:trPr>
         <w:tc>
           <w:tcPr>
-            <w:tcW w:type="dxa" w:w="2757"/>
+            <w:tcW w:type="dxa" w:w="2701"/>
             <w:tcBorders>
               <w:top w:val="single" w:color="BFBFBF" w:sz="4"/>
               <w:left w:val="single" w:color="BFBFBF" w:sz="4"/>
@@ -5748,13 +6671,13 @@
                 <w:sz w:val="16"/>
                 <w:szCs w:val="16"/>
               </w:rPr>
-              <w:t xml:space="preserve">Yağ asitliği, özdirenç, metal analizi</w:t>
-            </w:r>
-          </w:p>
-        </w:tc>
-        <w:tc>
-          <w:tcPr>
-            <w:tcW w:type="dxa" w:w="4212"/>
+              <w:t xml:space="preserve">Büküm, yapışma, FTIR, SEM/EDS, kesit</w:t>
+            </w:r>
+          </w:p>
+        </w:tc>
+        <w:tc>
+          <w:tcPr>
+            <w:tcW w:type="dxa" w:w="4288"/>
             <w:tcBorders>
               <w:top w:val="single" w:color="BFBFBF" w:sz="4"/>
               <w:left w:val="single" w:color="BFBFBF" w:sz="4"/>
@@ -5780,13 +6703,13 @@
                 <w:sz w:val="16"/>
                 <w:szCs w:val="16"/>
               </w:rPr>
-              <w:t xml:space="preserve">Dış laboratuvar ister</w:t>
-            </w:r>
-          </w:p>
-        </w:tc>
-        <w:tc>
-          <w:tcPr>
-            <w:tcW w:type="dxa" w:w="2669"/>
+              <w:t xml:space="preserve">Ek hazırlık ve dış hizmet ister</w:t>
+            </w:r>
+          </w:p>
+        </w:tc>
+        <w:tc>
+          <w:tcPr>
+            <w:tcW w:type="dxa" w:w="2649"/>
             <w:tcBorders>
               <w:top w:val="single" w:color="BFBFBF" w:sz="4"/>
               <w:left w:val="single" w:color="BFBFBF" w:sz="4"/>
@@ -5812,7 +6735,7 @@
                 <w:sz w:val="16"/>
                 <w:szCs w:val="16"/>
               </w:rPr>
-              <w:t xml:space="preserve">Saklanan yağ örneğiyle</w:t>
+              <w:t xml:space="preserve">Yalnız görünür hasar varsa</w:t>
             </w:r>
           </w:p>
         </w:tc>
@@ -5823,24 +6746,24 @@
         </w:trPr>
         <w:tc>
           <w:tcPr>
-            <w:tcW w:type="dxa" w:w="2757"/>
-            <w:tcBorders>
-              <w:top w:val="single" w:color="BFBFBF" w:sz="4"/>
-              <w:left w:val="single" w:color="BFBFBF" w:sz="4"/>
-              <w:bottom w:val="single" w:color="BFBFBF" w:sz="4"/>
-              <w:right w:val="single" w:color="BFBFBF" w:sz="4"/>
-            </w:tcBorders>
-            <w:tcMar>
-              <w:top w:type="dxa" w:w="30"/>
-              <w:left w:type="dxa" w:w="80"/>
-              <w:bottom w:type="dxa" w:w="30"/>
-              <w:right w:type="dxa" w:w="80"/>
-            </w:tcMar>
-            <w:vAlign w:val="top"/>
-          </w:tcPr>
-          <w:p>
-            <w:pPr>
-              <w:keepNext/>
+            <w:tcW w:type="dxa" w:w="2701"/>
+            <w:tcBorders>
+              <w:top w:val="single" w:color="BFBFBF" w:sz="4"/>
+              <w:left w:val="single" w:color="BFBFBF" w:sz="4"/>
+              <w:bottom w:val="single" w:color="BFBFBF" w:sz="4"/>
+              <w:right w:val="single" w:color="BFBFBF" w:sz="4"/>
+            </w:tcBorders>
+            <w:tcMar>
+              <w:top w:type="dxa" w:w="30"/>
+              <w:left w:type="dxa" w:w="80"/>
+              <w:bottom w:type="dxa" w:w="30"/>
+              <w:right w:type="dxa" w:w="80"/>
+            </w:tcMar>
+            <w:vAlign w:val="top"/>
+          </w:tcPr>
+          <w:p>
+            <w:pPr>
+              <w:keepNext w:val="false"/>
               <w:spacing w:after="0" w:before="0" w:line="240" w:lineRule="auto"/>
             </w:pPr>
             <w:r>
@@ -5850,87 +6773,19 @@
                 <w:sz w:val="16"/>
                 <w:szCs w:val="16"/>
               </w:rPr>
-              <w:t xml:space="preserve">Büküm, yapışma, FTIR, SEM/EDS, kesit</w:t>
-            </w:r>
-          </w:p>
-        </w:tc>
-        <w:tc>
-          <w:tcPr>
-            <w:tcW w:type="dxa" w:w="4212"/>
-            <w:tcBorders>
-              <w:top w:val="single" w:color="BFBFBF" w:sz="4"/>
-              <w:left w:val="single" w:color="BFBFBF" w:sz="4"/>
-              <w:bottom w:val="single" w:color="BFBFBF" w:sz="4"/>
-              <w:right w:val="single" w:color="BFBFBF" w:sz="4"/>
-            </w:tcBorders>
-            <w:tcMar>
-              <w:top w:type="dxa" w:w="30"/>
-              <w:left w:type="dxa" w:w="80"/>
-              <w:bottom w:type="dxa" w:w="30"/>
-              <w:right w:type="dxa" w:w="80"/>
-            </w:tcMar>
-            <w:vAlign w:val="top"/>
-          </w:tcPr>
-          <w:p>
-            <w:pPr>
-              <w:keepNext/>
-              <w:spacing w:after="0" w:before="0" w:line="240" w:lineRule="auto"/>
-            </w:pPr>
-            <w:r>
-              <w:rPr>
-                <w:sz w:val="16"/>
-                <w:szCs w:val="16"/>
-              </w:rPr>
-              <w:t xml:space="preserve">Ek hazırlık ve dış hizmet ister</w:t>
-            </w:r>
-          </w:p>
-        </w:tc>
-        <w:tc>
-          <w:tcPr>
-            <w:tcW w:type="dxa" w:w="2669"/>
-            <w:tcBorders>
-              <w:top w:val="single" w:color="BFBFBF" w:sz="4"/>
-              <w:left w:val="single" w:color="BFBFBF" w:sz="4"/>
-              <w:bottom w:val="single" w:color="BFBFBF" w:sz="4"/>
-              <w:right w:val="single" w:color="BFBFBF" w:sz="4"/>
-            </w:tcBorders>
-            <w:tcMar>
-              <w:top w:type="dxa" w:w="30"/>
-              <w:left w:type="dxa" w:w="80"/>
-              <w:bottom w:type="dxa" w:w="30"/>
-              <w:right w:type="dxa" w:w="80"/>
-            </w:tcMar>
-            <w:vAlign w:val="top"/>
-          </w:tcPr>
-          <w:p>
-            <w:pPr>
-              <w:keepNext/>
-              <w:spacing w:after="0" w:before="0" w:line="240" w:lineRule="auto"/>
-            </w:pPr>
-            <w:r>
-              <w:rPr>
-                <w:sz w:val="16"/>
-                <w:szCs w:val="16"/>
-              </w:rPr>
-              <w:t xml:space="preserve">Yalnız görünür hasar varsa</w:t>
-            </w:r>
-          </w:p>
-        </w:tc>
-      </w:tr>
-      <w:tr>
-        <w:trPr>
-          <w:cantSplit/>
-        </w:trPr>
-        <w:tc>
-          <w:tcPr>
-            <w:tcW w:type="dxa" w:w="2757"/>
-            <w:tcBorders>
-              <w:top w:val="single" w:color="BFBFBF" w:sz="4"/>
-              <w:left w:val="single" w:color="BFBFBF" w:sz="4"/>
-              <w:bottom w:val="single" w:color="BFBFBF" w:sz="4"/>
-              <w:right w:val="single" w:color="BFBFBF" w:sz="4"/>
-            </w:tcBorders>
-            <w:shd w:fill="F5F7FB" w:color="auto" w:val="clear"/>
+              <w:t xml:space="preserve">Gerilim altında yaşlandırma ve korozyon</w:t>
+            </w:r>
+          </w:p>
+        </w:tc>
+        <w:tc>
+          <w:tcPr>
+            <w:tcW w:type="dxa" w:w="4288"/>
+            <w:tcBorders>
+              <w:top w:val="single" w:color="BFBFBF" w:sz="4"/>
+              <w:left w:val="single" w:color="BFBFBF" w:sz="4"/>
+              <w:bottom w:val="single" w:color="BFBFBF" w:sz="4"/>
+              <w:right w:val="single" w:color="BFBFBF" w:sz="4"/>
+            </w:tcBorders>
             <w:tcMar>
               <w:top w:type="dxa" w:w="30"/>
               <w:left w:type="dxa" w:w="80"/>
@@ -5946,40 +6801,6 @@
             </w:pPr>
             <w:r>
               <w:rPr>
-                <w:b/>
-                <w:bCs/>
-                <w:sz w:val="16"/>
-                <w:szCs w:val="16"/>
-              </w:rPr>
-              <w:t xml:space="preserve">Gerilim altında yaşlandırma ve korozyon</w:t>
-            </w:r>
-          </w:p>
-        </w:tc>
-        <w:tc>
-          <w:tcPr>
-            <w:tcW w:type="dxa" w:w="4212"/>
-            <w:tcBorders>
-              <w:top w:val="single" w:color="BFBFBF" w:sz="4"/>
-              <w:left w:val="single" w:color="BFBFBF" w:sz="4"/>
-              <w:bottom w:val="single" w:color="BFBFBF" w:sz="4"/>
-              <w:right w:val="single" w:color="BFBFBF" w:sz="4"/>
-            </w:tcBorders>
-            <w:shd w:fill="F5F7FB" w:color="auto" w:val="clear"/>
-            <w:tcMar>
-              <w:top w:type="dxa" w:w="30"/>
-              <w:left w:type="dxa" w:w="80"/>
-              <w:bottom w:type="dxa" w:w="30"/>
-              <w:right w:type="dxa" w:w="80"/>
-            </w:tcMar>
-            <w:vAlign w:val="top"/>
-          </w:tcPr>
-          <w:p>
-            <w:pPr>
-              <w:keepNext w:val="false"/>
-              <w:spacing w:after="0" w:before="0" w:line="240" w:lineRule="auto"/>
-            </w:pPr>
-            <w:r>
-              <w:rPr>
                 <w:sz w:val="16"/>
                 <w:szCs w:val="16"/>
               </w:rPr>
@@ -5989,14 +6810,13 @@
         </w:tc>
         <w:tc>
           <w:tcPr>
-            <w:tcW w:type="dxa" w:w="2669"/>
-            <w:tcBorders>
-              <w:top w:val="single" w:color="BFBFBF" w:sz="4"/>
-              <w:left w:val="single" w:color="BFBFBF" w:sz="4"/>
-              <w:bottom w:val="single" w:color="BFBFBF" w:sz="4"/>
-              <w:right w:val="single" w:color="BFBFBF" w:sz="4"/>
-            </w:tcBorders>
-            <w:shd w:fill="F5F7FB" w:color="auto" w:val="clear"/>
+            <w:tcW w:type="dxa" w:w="2649"/>
+            <w:tcBorders>
+              <w:top w:val="single" w:color="BFBFBF" w:sz="4"/>
+              <w:left w:val="single" w:color="BFBFBF" w:sz="4"/>
+              <w:bottom w:val="single" w:color="BFBFBF" w:sz="4"/>
+              <w:right w:val="single" w:color="BFBFBF" w:sz="4"/>
+            </w:tcBorders>
             <w:tcMar>
               <w:top w:type="dxa" w:w="30"/>
               <w:left w:type="dxa" w:w="80"/>
@@ -6035,7 +6855,7 @@
           <w:sz w:val="20"/>
           <w:szCs w:val="20"/>
         </w:rPr>
-        <w:t xml:space="preserve">Açık kararlar: kullanılacak e-yağ ve parlama noktası, 150 °C'nin uygunluğu, kısmi deşarj ölçüm cihazına erişim ve FC ile B grubunun zamanlaması.</w:t>
+        <w:t xml:space="preserve">Açık kararlar: kullanılacak e-yağ ve parlama noktası, 150 °C'nin uygunluğu, kısmi deşarj ölçüm cihazına erişim, FC'nin dahil edilmesi ve B grubu malzemelerinin tedarik takvimi.</w:t>
       </w:r>
     </w:p>
     <w:sectPr>

</xml_diff>